<commit_message>
Fix contract DOCX rendering: use Sablon MERGEFIELD syntax
Sablon requires actual Word MailMerge fields, not plain {{var}} text. Updated the template prep script to inject MERGEFIELD elements with «=var_name» display text, and pass the context as a plain hash.
</commit_message>
<xml_diff>
--- a/backend/lib/templates/contract_cdd.docx
+++ b/backend/lib/templates/contract_cdd.docx
@@ -204,7 +204,55 @@
           <w:szCs w:val="24"/>
           <w:rtl/>
         </w:rPr>
-        <w:t>{{contract_number}}</w:t>
+        <w:fldChar w:fldCharType="begin"/>
+      </w:r>
+      <w:r>
+        <w:rPr>
+          <w:rFonts w:ascii="Arial" w:eastAsia="Arial" w:hAnsi="Arial" w:cs="Louguiya"/>
+          <w:b/>
+          <w:bCs/>
+          <w:color w:val="222222"/>
+          <w:sz w:val="24"/>
+          <w:szCs w:val="24"/>
+          <w:rtl/>
+        </w:rPr>
+        <w:instrText xml:space="preserve"> MERGEFIELD =contract_number \* MERGEFORMAT </w:instrText>
+      </w:r>
+      <w:r>
+        <w:rPr>
+          <w:rFonts w:ascii="Arial" w:eastAsia="Arial" w:hAnsi="Arial" w:cs="Louguiya"/>
+          <w:b/>
+          <w:bCs/>
+          <w:color w:val="222222"/>
+          <w:sz w:val="24"/>
+          <w:szCs w:val="24"/>
+          <w:rtl/>
+        </w:rPr>
+        <w:fldChar w:fldCharType="separate"/>
+      </w:r>
+      <w:r>
+        <w:rPr>
+          <w:rFonts w:ascii="Arial" w:eastAsia="Arial" w:hAnsi="Arial" w:cs="Louguiya"/>
+          <w:b/>
+          <w:bCs/>
+          <w:color w:val="222222"/>
+          <w:sz w:val="24"/>
+          <w:szCs w:val="24"/>
+          <w:rtl/>
+        </w:rPr>
+        <w:t>«=contract_number»</w:t>
+      </w:r>
+      <w:r>
+        <w:rPr>
+          <w:rFonts w:ascii="Arial" w:eastAsia="Arial" w:hAnsi="Arial" w:cs="Louguiya"/>
+          <w:b/>
+          <w:bCs/>
+          <w:color w:val="222222"/>
+          <w:sz w:val="24"/>
+          <w:szCs w:val="24"/>
+          <w:rtl/>
+        </w:rPr>
+        <w:fldChar w:fldCharType="end"/>
       </w:r>
       <w:r>
         <w:rPr>
@@ -405,7 +453,57 @@
           <w:szCs w:val="24"/>
           <w:rtl/>
         </w:rPr>
-        <w:t>السيد(ة): {{employee_name}}</w:t>
+        <w:t xml:space="preserve">السيد(ة): </w:t>
+      </w:r>
+      <w:r>
+        <w:rPr>
+          <w:rFonts w:ascii="Arial" w:eastAsia="Arial" w:hAnsi="Arial" w:cs="Louguiya"/>
+          <w:color w:val="222222"/>
+          <w:sz w:val="24"/>
+          <w:szCs w:val="24"/>
+          <w:rtl/>
+        </w:rPr>
+        <w:fldChar w:fldCharType="begin"/>
+      </w:r>
+      <w:r>
+        <w:rPr>
+          <w:rFonts w:ascii="Arial" w:eastAsia="Arial" w:hAnsi="Arial" w:cs="Louguiya"/>
+          <w:color w:val="222222"/>
+          <w:sz w:val="24"/>
+          <w:szCs w:val="24"/>
+          <w:rtl/>
+        </w:rPr>
+        <w:instrText xml:space="preserve"> MERGEFIELD =employee_name \* MERGEFORMAT </w:instrText>
+      </w:r>
+      <w:r>
+        <w:rPr>
+          <w:rFonts w:ascii="Arial" w:eastAsia="Arial" w:hAnsi="Arial" w:cs="Louguiya"/>
+          <w:color w:val="222222"/>
+          <w:sz w:val="24"/>
+          <w:szCs w:val="24"/>
+          <w:rtl/>
+        </w:rPr>
+        <w:fldChar w:fldCharType="separate"/>
+      </w:r>
+      <w:r>
+        <w:rPr>
+          <w:rFonts w:ascii="Arial" w:eastAsia="Arial" w:hAnsi="Arial" w:cs="Louguiya"/>
+          <w:color w:val="222222"/>
+          <w:sz w:val="24"/>
+          <w:szCs w:val="24"/>
+          <w:rtl/>
+        </w:rPr>
+        <w:t>«=employee_name»</w:t>
+      </w:r>
+      <w:r>
+        <w:rPr>
+          <w:rFonts w:ascii="Arial" w:eastAsia="Arial" w:hAnsi="Arial" w:cs="Louguiya"/>
+          <w:color w:val="222222"/>
+          <w:sz w:val="24"/>
+          <w:szCs w:val="24"/>
+          <w:rtl/>
+        </w:rPr>
+        <w:fldChar w:fldCharType="end"/>
       </w:r>
     </w:p>
     <w:p>
@@ -436,7 +534,117 @@
           <w:szCs w:val="24"/>
           <w:rtl/>
         </w:rPr>
-        <w:t>تاريخ ومحل الميلاد: {{birth_date}} - {{birth_place}}</w:t>
+        <w:t xml:space="preserve">تاريخ ومحل الميلاد: </w:t>
+      </w:r>
+      <w:r>
+        <w:rPr>
+          <w:rFonts w:ascii="Arial" w:eastAsia="Arial" w:hAnsi="Arial" w:cs="Louguiya"/>
+          <w:color w:val="222222"/>
+          <w:sz w:val="24"/>
+          <w:szCs w:val="24"/>
+          <w:rtl/>
+        </w:rPr>
+        <w:fldChar w:fldCharType="begin"/>
+      </w:r>
+      <w:r>
+        <w:rPr>
+          <w:rFonts w:ascii="Arial" w:eastAsia="Arial" w:hAnsi="Arial" w:cs="Louguiya"/>
+          <w:color w:val="222222"/>
+          <w:sz w:val="24"/>
+          <w:szCs w:val="24"/>
+          <w:rtl/>
+        </w:rPr>
+        <w:instrText xml:space="preserve"> MERGEFIELD =birth_date \* MERGEFORMAT </w:instrText>
+      </w:r>
+      <w:r>
+        <w:rPr>
+          <w:rFonts w:ascii="Arial" w:eastAsia="Arial" w:hAnsi="Arial" w:cs="Louguiya"/>
+          <w:color w:val="222222"/>
+          <w:sz w:val="24"/>
+          <w:szCs w:val="24"/>
+          <w:rtl/>
+        </w:rPr>
+        <w:fldChar w:fldCharType="separate"/>
+      </w:r>
+      <w:r>
+        <w:rPr>
+          <w:rFonts w:ascii="Arial" w:eastAsia="Arial" w:hAnsi="Arial" w:cs="Louguiya"/>
+          <w:color w:val="222222"/>
+          <w:sz w:val="24"/>
+          <w:szCs w:val="24"/>
+          <w:rtl/>
+        </w:rPr>
+        <w:t>«=birth_date»</w:t>
+      </w:r>
+      <w:r>
+        <w:rPr>
+          <w:rFonts w:ascii="Arial" w:eastAsia="Arial" w:hAnsi="Arial" w:cs="Louguiya"/>
+          <w:color w:val="222222"/>
+          <w:sz w:val="24"/>
+          <w:szCs w:val="24"/>
+          <w:rtl/>
+        </w:rPr>
+        <w:fldChar w:fldCharType="end"/>
+      </w:r>
+      <w:r>
+        <w:rPr>
+          <w:rFonts w:ascii="Arial" w:eastAsia="Arial" w:hAnsi="Arial" w:cs="Louguiya"/>
+          <w:color w:val="222222"/>
+          <w:sz w:val="24"/>
+          <w:szCs w:val="24"/>
+          <w:rtl/>
+        </w:rPr>
+        <w:t xml:space="preserve"> - </w:t>
+      </w:r>
+      <w:r>
+        <w:rPr>
+          <w:rFonts w:ascii="Arial" w:eastAsia="Arial" w:hAnsi="Arial" w:cs="Louguiya"/>
+          <w:color w:val="222222"/>
+          <w:sz w:val="24"/>
+          <w:szCs w:val="24"/>
+          <w:rtl/>
+        </w:rPr>
+        <w:fldChar w:fldCharType="begin"/>
+      </w:r>
+      <w:r>
+        <w:rPr>
+          <w:rFonts w:ascii="Arial" w:eastAsia="Arial" w:hAnsi="Arial" w:cs="Louguiya"/>
+          <w:color w:val="222222"/>
+          <w:sz w:val="24"/>
+          <w:szCs w:val="24"/>
+          <w:rtl/>
+        </w:rPr>
+        <w:instrText xml:space="preserve"> MERGEFIELD =birth_place \* MERGEFORMAT </w:instrText>
+      </w:r>
+      <w:r>
+        <w:rPr>
+          <w:rFonts w:ascii="Arial" w:eastAsia="Arial" w:hAnsi="Arial" w:cs="Louguiya"/>
+          <w:color w:val="222222"/>
+          <w:sz w:val="24"/>
+          <w:szCs w:val="24"/>
+          <w:rtl/>
+        </w:rPr>
+        <w:fldChar w:fldCharType="separate"/>
+      </w:r>
+      <w:r>
+        <w:rPr>
+          <w:rFonts w:ascii="Arial" w:eastAsia="Arial" w:hAnsi="Arial" w:cs="Louguiya"/>
+          <w:color w:val="222222"/>
+          <w:sz w:val="24"/>
+          <w:szCs w:val="24"/>
+          <w:rtl/>
+        </w:rPr>
+        <w:t>«=birth_place»</w:t>
+      </w:r>
+      <w:r>
+        <w:rPr>
+          <w:rFonts w:ascii="Arial" w:eastAsia="Arial" w:hAnsi="Arial" w:cs="Louguiya"/>
+          <w:color w:val="222222"/>
+          <w:sz w:val="24"/>
+          <w:szCs w:val="24"/>
+          <w:rtl/>
+        </w:rPr>
+        <w:fldChar w:fldCharType="end"/>
       </w:r>
     </w:p>
     <w:p>
@@ -467,7 +675,57 @@
           <w:szCs w:val="24"/>
           <w:rtl/>
         </w:rPr>
-        <w:t>الرقم الوطني للتعريف: {{nni}}</w:t>
+        <w:t xml:space="preserve">الرقم الوطني للتعريف: </w:t>
+      </w:r>
+      <w:r>
+        <w:rPr>
+          <w:rFonts w:ascii="Arial" w:eastAsia="Arial" w:hAnsi="Arial" w:cs="Louguiya"/>
+          <w:color w:val="222222"/>
+          <w:sz w:val="24"/>
+          <w:szCs w:val="24"/>
+          <w:rtl/>
+        </w:rPr>
+        <w:fldChar w:fldCharType="begin"/>
+      </w:r>
+      <w:r>
+        <w:rPr>
+          <w:rFonts w:ascii="Arial" w:eastAsia="Arial" w:hAnsi="Arial" w:cs="Louguiya"/>
+          <w:color w:val="222222"/>
+          <w:sz w:val="24"/>
+          <w:szCs w:val="24"/>
+          <w:rtl/>
+        </w:rPr>
+        <w:instrText xml:space="preserve"> MERGEFIELD =nni \* MERGEFORMAT </w:instrText>
+      </w:r>
+      <w:r>
+        <w:rPr>
+          <w:rFonts w:ascii="Arial" w:eastAsia="Arial" w:hAnsi="Arial" w:cs="Louguiya"/>
+          <w:color w:val="222222"/>
+          <w:sz w:val="24"/>
+          <w:szCs w:val="24"/>
+          <w:rtl/>
+        </w:rPr>
+        <w:fldChar w:fldCharType="separate"/>
+      </w:r>
+      <w:r>
+        <w:rPr>
+          <w:rFonts w:ascii="Arial" w:eastAsia="Arial" w:hAnsi="Arial" w:cs="Louguiya"/>
+          <w:color w:val="222222"/>
+          <w:sz w:val="24"/>
+          <w:szCs w:val="24"/>
+          <w:rtl/>
+        </w:rPr>
+        <w:t>«=nni»</w:t>
+      </w:r>
+      <w:r>
+        <w:rPr>
+          <w:rFonts w:ascii="Arial" w:eastAsia="Arial" w:hAnsi="Arial" w:cs="Louguiya"/>
+          <w:color w:val="222222"/>
+          <w:sz w:val="24"/>
+          <w:szCs w:val="24"/>
+          <w:rtl/>
+        </w:rPr>
+        <w:fldChar w:fldCharType="end"/>
       </w:r>
     </w:p>
     <w:p>
@@ -498,7 +756,57 @@
           <w:szCs w:val="24"/>
           <w:rtl/>
         </w:rPr>
-        <w:t>الهاتف / واتساب: {{phone}}</w:t>
+        <w:t xml:space="preserve">الهاتف / واتساب: </w:t>
+      </w:r>
+      <w:r>
+        <w:rPr>
+          <w:rFonts w:ascii="Arial" w:eastAsia="Arial" w:hAnsi="Arial" w:cs="Louguiya"/>
+          <w:color w:val="222222"/>
+          <w:sz w:val="24"/>
+          <w:szCs w:val="24"/>
+          <w:rtl/>
+        </w:rPr>
+        <w:fldChar w:fldCharType="begin"/>
+      </w:r>
+      <w:r>
+        <w:rPr>
+          <w:rFonts w:ascii="Arial" w:eastAsia="Arial" w:hAnsi="Arial" w:cs="Louguiya"/>
+          <w:color w:val="222222"/>
+          <w:sz w:val="24"/>
+          <w:szCs w:val="24"/>
+          <w:rtl/>
+        </w:rPr>
+        <w:instrText xml:space="preserve"> MERGEFIELD =phone \* MERGEFORMAT </w:instrText>
+      </w:r>
+      <w:r>
+        <w:rPr>
+          <w:rFonts w:ascii="Arial" w:eastAsia="Arial" w:hAnsi="Arial" w:cs="Louguiya"/>
+          <w:color w:val="222222"/>
+          <w:sz w:val="24"/>
+          <w:szCs w:val="24"/>
+          <w:rtl/>
+        </w:rPr>
+        <w:fldChar w:fldCharType="separate"/>
+      </w:r>
+      <w:r>
+        <w:rPr>
+          <w:rFonts w:ascii="Arial" w:eastAsia="Arial" w:hAnsi="Arial" w:cs="Louguiya"/>
+          <w:color w:val="222222"/>
+          <w:sz w:val="24"/>
+          <w:szCs w:val="24"/>
+          <w:rtl/>
+        </w:rPr>
+        <w:t>«=phone»</w:t>
+      </w:r>
+      <w:r>
+        <w:rPr>
+          <w:rFonts w:ascii="Arial" w:eastAsia="Arial" w:hAnsi="Arial" w:cs="Louguiya"/>
+          <w:color w:val="222222"/>
+          <w:sz w:val="24"/>
+          <w:szCs w:val="24"/>
+          <w:rtl/>
+        </w:rPr>
+        <w:fldChar w:fldCharType="end"/>
       </w:r>
     </w:p>
     <w:p>
@@ -710,7 +1018,47 @@
           <w:szCs w:val="24"/>
           <w:rtl/>
         </w:rPr>
-        <w:t>{{job_title}}</w:t>
+        <w:fldChar w:fldCharType="begin"/>
+      </w:r>
+      <w:r>
+        <w:rPr>
+          <w:rFonts w:ascii="Arial" w:eastAsia="Arial" w:hAnsi="Arial" w:cs="Louguiya"/>
+          <w:color w:val="EE0000"/>
+          <w:sz w:val="24"/>
+          <w:szCs w:val="24"/>
+          <w:rtl/>
+        </w:rPr>
+        <w:instrText xml:space="preserve"> MERGEFIELD =job_title \* MERGEFORMAT </w:instrText>
+      </w:r>
+      <w:r>
+        <w:rPr>
+          <w:rFonts w:ascii="Arial" w:eastAsia="Arial" w:hAnsi="Arial" w:cs="Louguiya"/>
+          <w:color w:val="EE0000"/>
+          <w:sz w:val="24"/>
+          <w:szCs w:val="24"/>
+          <w:rtl/>
+        </w:rPr>
+        <w:fldChar w:fldCharType="separate"/>
+      </w:r>
+      <w:r>
+        <w:rPr>
+          <w:rFonts w:ascii="Arial" w:eastAsia="Arial" w:hAnsi="Arial" w:cs="Louguiya"/>
+          <w:color w:val="EE0000"/>
+          <w:sz w:val="24"/>
+          <w:szCs w:val="24"/>
+          <w:rtl/>
+        </w:rPr>
+        <w:t>«=job_title»</w:t>
+      </w:r>
+      <w:r>
+        <w:rPr>
+          <w:rFonts w:ascii="Arial" w:eastAsia="Arial" w:hAnsi="Arial" w:cs="Louguiya"/>
+          <w:color w:val="EE0000"/>
+          <w:sz w:val="24"/>
+          <w:szCs w:val="24"/>
+          <w:rtl/>
+        </w:rPr>
+        <w:fldChar w:fldCharType="end"/>
       </w:r>
       <w:r>
         <w:rPr>
@@ -1154,7 +1502,57 @@
           <w:szCs w:val="24"/>
           <w:rtl/>
         </w:rPr>
-        <w:t>{{amount}} أوقية</w:t>
+        <w:fldChar w:fldCharType="begin"/>
+      </w:r>
+      <w:r>
+        <w:rPr>
+          <w:rFonts w:ascii="Arial" w:eastAsia="Arial" w:hAnsi="Arial" w:cs="Louguiya"/>
+          <w:color w:val="EE0000"/>
+          <w:sz w:val="24"/>
+          <w:szCs w:val="24"/>
+          <w:rtl/>
+        </w:rPr>
+        <w:instrText xml:space="preserve"> MERGEFIELD =amount \* MERGEFORMAT </w:instrText>
+      </w:r>
+      <w:r>
+        <w:rPr>
+          <w:rFonts w:ascii="Arial" w:eastAsia="Arial" w:hAnsi="Arial" w:cs="Louguiya"/>
+          <w:color w:val="EE0000"/>
+          <w:sz w:val="24"/>
+          <w:szCs w:val="24"/>
+          <w:rtl/>
+        </w:rPr>
+        <w:fldChar w:fldCharType="separate"/>
+      </w:r>
+      <w:r>
+        <w:rPr>
+          <w:rFonts w:ascii="Arial" w:eastAsia="Arial" w:hAnsi="Arial" w:cs="Louguiya"/>
+          <w:color w:val="EE0000"/>
+          <w:sz w:val="24"/>
+          <w:szCs w:val="24"/>
+          <w:rtl/>
+        </w:rPr>
+        <w:t>«=amount»</w:t>
+      </w:r>
+      <w:r>
+        <w:rPr>
+          <w:rFonts w:ascii="Arial" w:eastAsia="Arial" w:hAnsi="Arial" w:cs="Louguiya"/>
+          <w:color w:val="EE0000"/>
+          <w:sz w:val="24"/>
+          <w:szCs w:val="24"/>
+          <w:rtl/>
+        </w:rPr>
+        <w:fldChar w:fldCharType="end"/>
+      </w:r>
+      <w:r>
+        <w:rPr>
+          <w:rFonts w:ascii="Arial" w:eastAsia="Arial" w:hAnsi="Arial" w:cs="Louguiya"/>
+          <w:color w:val="EE0000"/>
+          <w:sz w:val="24"/>
+          <w:szCs w:val="24"/>
+          <w:rtl/>
+        </w:rPr>
+        <w:t xml:space="preserve"> أوقية</w:t>
       </w:r>
       <w:proofErr w:type="gramEnd"/>
       <w:r>
@@ -1241,7 +1639,47 @@
           <w:szCs w:val="24"/>
           <w:rtl/>
         </w:rPr>
-        <w:t>{{start_date}}</w:t>
+        <w:fldChar w:fldCharType="begin"/>
+      </w:r>
+      <w:r>
+        <w:rPr>
+          <w:rFonts w:ascii="Arial" w:eastAsia="Arial" w:hAnsi="Arial" w:cs="Louguiya"/>
+          <w:color w:val="EE0000"/>
+          <w:sz w:val="24"/>
+          <w:szCs w:val="24"/>
+          <w:rtl/>
+        </w:rPr>
+        <w:instrText xml:space="preserve"> MERGEFIELD =start_date \* MERGEFORMAT </w:instrText>
+      </w:r>
+      <w:r>
+        <w:rPr>
+          <w:rFonts w:ascii="Arial" w:eastAsia="Arial" w:hAnsi="Arial" w:cs="Louguiya"/>
+          <w:color w:val="EE0000"/>
+          <w:sz w:val="24"/>
+          <w:szCs w:val="24"/>
+          <w:rtl/>
+        </w:rPr>
+        <w:fldChar w:fldCharType="separate"/>
+      </w:r>
+      <w:r>
+        <w:rPr>
+          <w:rFonts w:ascii="Arial" w:eastAsia="Arial" w:hAnsi="Arial" w:cs="Louguiya"/>
+          <w:color w:val="EE0000"/>
+          <w:sz w:val="24"/>
+          <w:szCs w:val="24"/>
+          <w:rtl/>
+        </w:rPr>
+        <w:t>«=start_date»</w:t>
+      </w:r>
+      <w:r>
+        <w:rPr>
+          <w:rFonts w:ascii="Arial" w:eastAsia="Arial" w:hAnsi="Arial" w:cs="Louguiya"/>
+          <w:color w:val="EE0000"/>
+          <w:sz w:val="24"/>
+          <w:szCs w:val="24"/>
+          <w:rtl/>
+        </w:rPr>
+        <w:fldChar w:fldCharType="end"/>
       </w:r>
       <w:r>
         <w:rPr>
@@ -2202,7 +2640,57 @@
           <w:szCs w:val="24"/>
           <w:rtl/>
         </w:rPr>
-        <w:t>حرر في نواكشوط بتاريخ {{signing_date}}</w:t>
+        <w:t xml:space="preserve">حرر في نواكشوط بتاريخ </w:t>
+      </w:r>
+      <w:r>
+        <w:rPr>
+          <w:rFonts w:ascii="Arial" w:eastAsia="Arial" w:hAnsi="Arial" w:cs="Louguiya"/>
+          <w:color w:val="222222"/>
+          <w:sz w:val="24"/>
+          <w:szCs w:val="24"/>
+          <w:rtl/>
+        </w:rPr>
+        <w:fldChar w:fldCharType="begin"/>
+      </w:r>
+      <w:r>
+        <w:rPr>
+          <w:rFonts w:ascii="Arial" w:eastAsia="Arial" w:hAnsi="Arial" w:cs="Louguiya"/>
+          <w:color w:val="222222"/>
+          <w:sz w:val="24"/>
+          <w:szCs w:val="24"/>
+          <w:rtl/>
+        </w:rPr>
+        <w:instrText xml:space="preserve"> MERGEFIELD =signing_date \* MERGEFORMAT </w:instrText>
+      </w:r>
+      <w:r>
+        <w:rPr>
+          <w:rFonts w:ascii="Arial" w:eastAsia="Arial" w:hAnsi="Arial" w:cs="Louguiya"/>
+          <w:color w:val="222222"/>
+          <w:sz w:val="24"/>
+          <w:szCs w:val="24"/>
+          <w:rtl/>
+        </w:rPr>
+        <w:fldChar w:fldCharType="separate"/>
+      </w:r>
+      <w:r>
+        <w:rPr>
+          <w:rFonts w:ascii="Arial" w:eastAsia="Arial" w:hAnsi="Arial" w:cs="Louguiya"/>
+          <w:color w:val="222222"/>
+          <w:sz w:val="24"/>
+          <w:szCs w:val="24"/>
+          <w:rtl/>
+        </w:rPr>
+        <w:t>«=signing_date»</w:t>
+      </w:r>
+      <w:r>
+        <w:rPr>
+          <w:rFonts w:ascii="Arial" w:eastAsia="Arial" w:hAnsi="Arial" w:cs="Louguiya"/>
+          <w:color w:val="222222"/>
+          <w:sz w:val="24"/>
+          <w:szCs w:val="24"/>
+          <w:rtl/>
+        </w:rPr>
+        <w:fldChar w:fldCharType="end"/>
       </w:r>
     </w:p>
     <w:p>
@@ -2369,7 +2857,47 @@
           <w:szCs w:val="24"/>
           <w:rtl/>
         </w:rPr>
-        <w:t>{{job_title}}</w:t>
+        <w:fldChar w:fldCharType="begin"/>
+      </w:r>
+      <w:r>
+        <w:rPr>
+          <w:rFonts w:ascii="Arial" w:eastAsia="Arial" w:hAnsi="Arial" w:cs="Louguiya"/>
+          <w:color w:val="EE0000"/>
+          <w:sz w:val="24"/>
+          <w:szCs w:val="24"/>
+          <w:rtl/>
+        </w:rPr>
+        <w:instrText xml:space="preserve"> MERGEFIELD =job_title \* MERGEFORMAT </w:instrText>
+      </w:r>
+      <w:r>
+        <w:rPr>
+          <w:rFonts w:ascii="Arial" w:eastAsia="Arial" w:hAnsi="Arial" w:cs="Louguiya"/>
+          <w:color w:val="EE0000"/>
+          <w:sz w:val="24"/>
+          <w:szCs w:val="24"/>
+          <w:rtl/>
+        </w:rPr>
+        <w:fldChar w:fldCharType="separate"/>
+      </w:r>
+      <w:r>
+        <w:rPr>
+          <w:rFonts w:ascii="Arial" w:eastAsia="Arial" w:hAnsi="Arial" w:cs="Louguiya"/>
+          <w:color w:val="EE0000"/>
+          <w:sz w:val="24"/>
+          <w:szCs w:val="24"/>
+          <w:rtl/>
+        </w:rPr>
+        <w:t>«=job_title»</w:t>
+      </w:r>
+      <w:r>
+        <w:rPr>
+          <w:rFonts w:ascii="Arial" w:eastAsia="Arial" w:hAnsi="Arial" w:cs="Louguiya"/>
+          <w:color w:val="EE0000"/>
+          <w:sz w:val="24"/>
+          <w:szCs w:val="24"/>
+          <w:rtl/>
+        </w:rPr>
+        <w:fldChar w:fldCharType="end"/>
       </w:r>
       <w:proofErr w:type="gramStart"/>
       <w:r>
@@ -2480,7 +3008,47 @@
           <w:szCs w:val="24"/>
           <w:rtl/>
         </w:rPr>
-        <w:t>{{employee_name_fr}}</w:t>
+        <w:fldChar w:fldCharType="begin"/>
+      </w:r>
+      <w:r>
+        <w:rPr>
+          <w:rFonts w:ascii="Arial" w:eastAsia="Arial" w:hAnsi="Arial" w:cs="Louguiya"/>
+          <w:color w:val="222222"/>
+          <w:sz w:val="24"/>
+          <w:szCs w:val="24"/>
+          <w:rtl/>
+        </w:rPr>
+        <w:instrText xml:space="preserve"> MERGEFIELD =employee_name_fr \* MERGEFORMAT </w:instrText>
+      </w:r>
+      <w:r>
+        <w:rPr>
+          <w:rFonts w:ascii="Arial" w:eastAsia="Arial" w:hAnsi="Arial" w:cs="Louguiya"/>
+          <w:color w:val="222222"/>
+          <w:sz w:val="24"/>
+          <w:szCs w:val="24"/>
+          <w:rtl/>
+        </w:rPr>
+        <w:fldChar w:fldCharType="separate"/>
+      </w:r>
+      <w:r>
+        <w:rPr>
+          <w:rFonts w:ascii="Arial" w:eastAsia="Arial" w:hAnsi="Arial" w:cs="Louguiya"/>
+          <w:color w:val="222222"/>
+          <w:sz w:val="24"/>
+          <w:szCs w:val="24"/>
+          <w:rtl/>
+        </w:rPr>
+        <w:t>«=employee_name_fr»</w:t>
+      </w:r>
+      <w:r>
+        <w:rPr>
+          <w:rFonts w:ascii="Arial" w:eastAsia="Arial" w:hAnsi="Arial" w:cs="Louguiya"/>
+          <w:color w:val="222222"/>
+          <w:sz w:val="24"/>
+          <w:szCs w:val="24"/>
+          <w:rtl/>
+        </w:rPr>
+        <w:fldChar w:fldCharType="end"/>
       </w:r>
     </w:p>
     <w:p>

</xml_diff>

<commit_message>
Output contract as PDF with bold filled values
Convert rendered DOCX to PDF via LibreOffice headless (soffice on prod). Make MERGEFIELD display runs bold (b + bCs for Arabic) so substituted values stand out in the final document. Filename uses .pdf and the / in the reference is replaced with - for safety.
</commit_message>
<xml_diff>
--- a/backend/lib/templates/contract_cdd.docx
+++ b/backend/lib/templates/contract_cdd.docx
@@ -492,6 +492,8 @@
           <w:sz w:val="24"/>
           <w:szCs w:val="24"/>
           <w:rtl/>
+          <w:b/>
+          <w:bCs/>
         </w:rPr>
         <w:t>«=employee_name»</w:t>
       </w:r>
@@ -573,6 +575,8 @@
           <w:sz w:val="24"/>
           <w:szCs w:val="24"/>
           <w:rtl/>
+          <w:b/>
+          <w:bCs/>
         </w:rPr>
         <w:t>«=birth_date»</w:t>
       </w:r>
@@ -633,6 +637,8 @@
           <w:sz w:val="24"/>
           <w:szCs w:val="24"/>
           <w:rtl/>
+          <w:b/>
+          <w:bCs/>
         </w:rPr>
         <w:t>«=birth_place»</w:t>
       </w:r>
@@ -714,6 +720,8 @@
           <w:sz w:val="24"/>
           <w:szCs w:val="24"/>
           <w:rtl/>
+          <w:b/>
+          <w:bCs/>
         </w:rPr>
         <w:t>«=nni»</w:t>
       </w:r>
@@ -795,6 +803,8 @@
           <w:sz w:val="24"/>
           <w:szCs w:val="24"/>
           <w:rtl/>
+          <w:b/>
+          <w:bCs/>
         </w:rPr>
         <w:t>«=phone»</w:t>
       </w:r>
@@ -1047,6 +1057,8 @@
           <w:sz w:val="24"/>
           <w:szCs w:val="24"/>
           <w:rtl/>
+          <w:b/>
+          <w:bCs/>
         </w:rPr>
         <w:t>«=job_title»</w:t>
       </w:r>
@@ -1531,6 +1543,8 @@
           <w:sz w:val="24"/>
           <w:szCs w:val="24"/>
           <w:rtl/>
+          <w:b/>
+          <w:bCs/>
         </w:rPr>
         <w:t>«=amount»</w:t>
       </w:r>
@@ -1668,6 +1682,8 @@
           <w:sz w:val="24"/>
           <w:szCs w:val="24"/>
           <w:rtl/>
+          <w:b/>
+          <w:bCs/>
         </w:rPr>
         <w:t>«=start_date»</w:t>
       </w:r>
@@ -2679,6 +2695,8 @@
           <w:sz w:val="24"/>
           <w:szCs w:val="24"/>
           <w:rtl/>
+          <w:b/>
+          <w:bCs/>
         </w:rPr>
         <w:t>«=signing_date»</w:t>
       </w:r>
@@ -2886,6 +2904,8 @@
           <w:sz w:val="24"/>
           <w:szCs w:val="24"/>
           <w:rtl/>
+          <w:b/>
+          <w:bCs/>
         </w:rPr>
         <w:t>«=job_title»</w:t>
       </w:r>
@@ -3037,6 +3057,8 @@
           <w:sz w:val="24"/>
           <w:szCs w:val="24"/>
           <w:rtl/>
+          <w:b/>
+          <w:bCs/>
         </w:rPr>
         <w:t>«=employee_name_fr»</w:t>
       </w:r>

</xml_diff>

<commit_message>
Update CDD contract template
</commit_message>
<xml_diff>
--- a/backend/lib/templates/contract_cdd.docx
+++ b/backend/lib/templates/contract_cdd.docx
@@ -408,7 +408,6 @@
           <w:color w:val="222222"/>
           <w:sz w:val="24"/>
           <w:szCs w:val="24"/>
-          <w:highlight w:val="white"/>
           <w:u w:val="single"/>
           <w:rtl/>
         </w:rPr>
@@ -420,7 +419,6 @@
           <w:color w:val="222222"/>
           <w:sz w:val="24"/>
           <w:szCs w:val="24"/>
-          <w:highlight w:val="white"/>
         </w:rPr>
         <w:t xml:space="preserve"> </w:t>
       </w:r>
@@ -442,18 +440,27 @@
           <w:color w:val="222222"/>
           <w:sz w:val="24"/>
           <w:szCs w:val="24"/>
-          <w:highlight w:val="yellow"/>
-        </w:rPr>
-      </w:pPr>
-      <w:r>
-        <w:rPr>
-          <w:rFonts w:ascii="Arial" w:eastAsia="Arial" w:hAnsi="Arial" w:cs="Louguiya"/>
-          <w:color w:val="222222"/>
-          <w:sz w:val="24"/>
-          <w:szCs w:val="24"/>
-          <w:rtl/>
-        </w:rPr>
-        <w:t xml:space="preserve">السيد(ة): </w:t>
+        </w:rPr>
+      </w:pPr>
+      <w:r>
+        <w:rPr>
+          <w:rFonts w:ascii="Arial" w:eastAsia="Arial" w:hAnsi="Arial" w:cs="Louguiya"/>
+          <w:color w:val="222222"/>
+          <w:sz w:val="24"/>
+          <w:szCs w:val="24"/>
+          <w:rtl/>
+        </w:rPr>
+        <w:t>السيد</w:t>
+      </w:r>
+      <w:r>
+        <w:rPr>
+          <w:rFonts w:ascii="Arial" w:eastAsia="Arial" w:hAnsi="Arial" w:cs="Louguiya"/>
+          <w:color w:val="222222"/>
+          <w:sz w:val="24"/>
+          <w:szCs w:val="24"/>
+          <w:rtl/>
+        </w:rPr>
+        <w:t xml:space="preserve">(ة): </w:t>
       </w:r>
       <w:r>
         <w:rPr>
@@ -488,14 +495,40 @@
       <w:r>
         <w:rPr>
           <w:rFonts w:ascii="Arial" w:eastAsia="Arial" w:hAnsi="Arial" w:cs="Louguiya"/>
-          <w:color w:val="222222"/>
-          <w:sz w:val="24"/>
-          <w:szCs w:val="24"/>
-          <w:rtl/>
-          <w:b/>
-          <w:bCs/>
-        </w:rPr>
-        <w:t>«=employee_name»</w:t>
+          <w:b/>
+          <w:bCs/>
+          <w:color w:val="222222"/>
+          <w:sz w:val="24"/>
+          <w:szCs w:val="24"/>
+          <w:rtl/>
+        </w:rPr>
+        <w:t>«=</w:t>
+      </w:r>
+      <w:proofErr w:type="spellStart"/>
+      <w:r>
+        <w:rPr>
+          <w:rFonts w:ascii="Arial" w:eastAsia="Arial" w:hAnsi="Arial" w:cs="Louguiya"/>
+          <w:b/>
+          <w:bCs/>
+          <w:color w:val="222222"/>
+          <w:sz w:val="24"/>
+          <w:szCs w:val="24"/>
+          <w:rtl/>
+        </w:rPr>
+        <w:t>employee_name</w:t>
+      </w:r>
+      <w:proofErr w:type="spellEnd"/>
+      <w:r>
+        <w:rPr>
+          <w:rFonts w:ascii="Arial" w:eastAsia="Arial" w:hAnsi="Arial" w:cs="Louguiya"/>
+          <w:b/>
+          <w:bCs/>
+          <w:color w:val="222222"/>
+          <w:sz w:val="24"/>
+          <w:szCs w:val="24"/>
+          <w:rtl/>
+        </w:rPr>
+        <w:t>»</w:t>
       </w:r>
       <w:r>
         <w:rPr>
@@ -525,7 +558,6 @@
           <w:color w:val="222222"/>
           <w:sz w:val="24"/>
           <w:szCs w:val="24"/>
-          <w:highlight w:val="yellow"/>
         </w:rPr>
       </w:pPr>
       <w:r>
@@ -571,14 +603,40 @@
       <w:r>
         <w:rPr>
           <w:rFonts w:ascii="Arial" w:eastAsia="Arial" w:hAnsi="Arial" w:cs="Louguiya"/>
-          <w:color w:val="222222"/>
-          <w:sz w:val="24"/>
-          <w:szCs w:val="24"/>
-          <w:rtl/>
-          <w:b/>
-          <w:bCs/>
-        </w:rPr>
-        <w:t>«=birth_date»</w:t>
+          <w:b/>
+          <w:bCs/>
+          <w:color w:val="222222"/>
+          <w:sz w:val="24"/>
+          <w:szCs w:val="24"/>
+          <w:rtl/>
+        </w:rPr>
+        <w:t>«=</w:t>
+      </w:r>
+      <w:proofErr w:type="spellStart"/>
+      <w:r>
+        <w:rPr>
+          <w:rFonts w:ascii="Arial" w:eastAsia="Arial" w:hAnsi="Arial" w:cs="Louguiya"/>
+          <w:b/>
+          <w:bCs/>
+          <w:color w:val="222222"/>
+          <w:sz w:val="24"/>
+          <w:szCs w:val="24"/>
+          <w:rtl/>
+        </w:rPr>
+        <w:t>birth_date</w:t>
+      </w:r>
+      <w:proofErr w:type="spellEnd"/>
+      <w:r>
+        <w:rPr>
+          <w:rFonts w:ascii="Arial" w:eastAsia="Arial" w:hAnsi="Arial" w:cs="Louguiya"/>
+          <w:b/>
+          <w:bCs/>
+          <w:color w:val="222222"/>
+          <w:sz w:val="24"/>
+          <w:szCs w:val="24"/>
+          <w:rtl/>
+        </w:rPr>
+        <w:t>»</w:t>
       </w:r>
       <w:r>
         <w:rPr>
@@ -633,12 +691,12 @@
       <w:r>
         <w:rPr>
           <w:rFonts w:ascii="Arial" w:eastAsia="Arial" w:hAnsi="Arial" w:cs="Louguiya"/>
-          <w:color w:val="222222"/>
-          <w:sz w:val="24"/>
-          <w:szCs w:val="24"/>
-          <w:rtl/>
-          <w:b/>
-          <w:bCs/>
+          <w:b/>
+          <w:bCs/>
+          <w:color w:val="222222"/>
+          <w:sz w:val="24"/>
+          <w:szCs w:val="24"/>
+          <w:rtl/>
         </w:rPr>
         <w:t>«=birth_place»</w:t>
       </w:r>
@@ -670,7 +728,6 @@
           <w:color w:val="222222"/>
           <w:sz w:val="24"/>
           <w:szCs w:val="24"/>
-          <w:highlight w:val="yellow"/>
         </w:rPr>
       </w:pPr>
       <w:r>
@@ -716,14 +773,40 @@
       <w:r>
         <w:rPr>
           <w:rFonts w:ascii="Arial" w:eastAsia="Arial" w:hAnsi="Arial" w:cs="Louguiya"/>
-          <w:color w:val="222222"/>
-          <w:sz w:val="24"/>
-          <w:szCs w:val="24"/>
-          <w:rtl/>
-          <w:b/>
-          <w:bCs/>
-        </w:rPr>
-        <w:t>«=nni»</w:t>
+          <w:b/>
+          <w:bCs/>
+          <w:color w:val="222222"/>
+          <w:sz w:val="24"/>
+          <w:szCs w:val="24"/>
+          <w:rtl/>
+        </w:rPr>
+        <w:t>«=</w:t>
+      </w:r>
+      <w:proofErr w:type="spellStart"/>
+      <w:r>
+        <w:rPr>
+          <w:rFonts w:ascii="Arial" w:eastAsia="Arial" w:hAnsi="Arial" w:cs="Louguiya"/>
+          <w:b/>
+          <w:bCs/>
+          <w:color w:val="222222"/>
+          <w:sz w:val="24"/>
+          <w:szCs w:val="24"/>
+          <w:rtl/>
+        </w:rPr>
+        <w:t>nni</w:t>
+      </w:r>
+      <w:proofErr w:type="spellEnd"/>
+      <w:r>
+        <w:rPr>
+          <w:rFonts w:ascii="Arial" w:eastAsia="Arial" w:hAnsi="Arial" w:cs="Louguiya"/>
+          <w:b/>
+          <w:bCs/>
+          <w:color w:val="222222"/>
+          <w:sz w:val="24"/>
+          <w:szCs w:val="24"/>
+          <w:rtl/>
+        </w:rPr>
+        <w:t>»</w:t>
       </w:r>
       <w:r>
         <w:rPr>
@@ -753,7 +836,6 @@
           <w:color w:val="222222"/>
           <w:sz w:val="24"/>
           <w:szCs w:val="24"/>
-          <w:highlight w:val="yellow"/>
         </w:rPr>
       </w:pPr>
       <w:r>
@@ -799,14 +881,40 @@
       <w:r>
         <w:rPr>
           <w:rFonts w:ascii="Arial" w:eastAsia="Arial" w:hAnsi="Arial" w:cs="Louguiya"/>
-          <w:color w:val="222222"/>
-          <w:sz w:val="24"/>
-          <w:szCs w:val="24"/>
-          <w:rtl/>
-          <w:b/>
-          <w:bCs/>
-        </w:rPr>
-        <w:t>«=phone»</w:t>
+          <w:b/>
+          <w:bCs/>
+          <w:color w:val="222222"/>
+          <w:sz w:val="24"/>
+          <w:szCs w:val="24"/>
+          <w:rtl/>
+        </w:rPr>
+        <w:t>«=</w:t>
+      </w:r>
+      <w:proofErr w:type="spellStart"/>
+      <w:r>
+        <w:rPr>
+          <w:rFonts w:ascii="Arial" w:eastAsia="Arial" w:hAnsi="Arial" w:cs="Louguiya"/>
+          <w:b/>
+          <w:bCs/>
+          <w:color w:val="222222"/>
+          <w:sz w:val="24"/>
+          <w:szCs w:val="24"/>
+          <w:rtl/>
+        </w:rPr>
+        <w:t>phone</w:t>
+      </w:r>
+      <w:proofErr w:type="spellEnd"/>
+      <w:r>
+        <w:rPr>
+          <w:rFonts w:ascii="Arial" w:eastAsia="Arial" w:hAnsi="Arial" w:cs="Louguiya"/>
+          <w:b/>
+          <w:bCs/>
+          <w:color w:val="222222"/>
+          <w:sz w:val="24"/>
+          <w:szCs w:val="24"/>
+          <w:rtl/>
+        </w:rPr>
+        <w:t>»</w:t>
       </w:r>
       <w:r>
         <w:rPr>
@@ -1023,7 +1131,7 @@
       <w:r>
         <w:rPr>
           <w:rFonts w:ascii="Arial" w:eastAsia="Arial" w:hAnsi="Arial" w:cs="Louguiya"/>
-          <w:color w:val="EE0000"/>
+          <w:color w:val="000000" w:themeColor="text1"/>
           <w:sz w:val="24"/>
           <w:szCs w:val="24"/>
           <w:rtl/>
@@ -1033,7 +1141,7 @@
       <w:r>
         <w:rPr>
           <w:rFonts w:ascii="Arial" w:eastAsia="Arial" w:hAnsi="Arial" w:cs="Louguiya"/>
-          <w:color w:val="EE0000"/>
+          <w:color w:val="000000" w:themeColor="text1"/>
           <w:sz w:val="24"/>
           <w:szCs w:val="24"/>
           <w:rtl/>
@@ -1043,7 +1151,7 @@
       <w:r>
         <w:rPr>
           <w:rFonts w:ascii="Arial" w:eastAsia="Arial" w:hAnsi="Arial" w:cs="Louguiya"/>
-          <w:color w:val="EE0000"/>
+          <w:color w:val="000000" w:themeColor="text1"/>
           <w:sz w:val="24"/>
           <w:szCs w:val="24"/>
           <w:rtl/>
@@ -1053,19 +1161,19 @@
       <w:r>
         <w:rPr>
           <w:rFonts w:ascii="Arial" w:eastAsia="Arial" w:hAnsi="Arial" w:cs="Louguiya"/>
-          <w:color w:val="EE0000"/>
-          <w:sz w:val="24"/>
-          <w:szCs w:val="24"/>
-          <w:rtl/>
-          <w:b/>
-          <w:bCs/>
+          <w:b/>
+          <w:bCs/>
+          <w:color w:val="000000" w:themeColor="text1"/>
+          <w:sz w:val="24"/>
+          <w:szCs w:val="24"/>
+          <w:rtl/>
         </w:rPr>
         <w:t>«=job_title»</w:t>
       </w:r>
       <w:r>
         <w:rPr>
           <w:rFonts w:ascii="Arial" w:eastAsia="Arial" w:hAnsi="Arial" w:cs="Louguiya"/>
-          <w:color w:val="EE0000"/>
+          <w:color w:val="000000" w:themeColor="text1"/>
           <w:sz w:val="24"/>
           <w:szCs w:val="24"/>
           <w:rtl/>
@@ -1233,7 +1341,31 @@
           <w:highlight w:val="white"/>
           <w:rtl/>
         </w:rPr>
-        <w:t xml:space="preserve"> الميدانية للمحاظر المكلف بها بجدية ووفق التعليمات الصادرة؛</w:t>
+        <w:t xml:space="preserve"> الميدانية </w:t>
+      </w:r>
+      <w:proofErr w:type="spellStart"/>
+      <w:r>
+        <w:rPr>
+          <w:rFonts w:ascii="Arial" w:eastAsia="Arial" w:hAnsi="Arial" w:cs="Louguiya"/>
+          <w:color w:val="222222"/>
+          <w:sz w:val="24"/>
+          <w:szCs w:val="24"/>
+          <w:highlight w:val="white"/>
+          <w:rtl/>
+        </w:rPr>
+        <w:t>للمحاظر</w:t>
+      </w:r>
+      <w:proofErr w:type="spellEnd"/>
+      <w:r>
+        <w:rPr>
+          <w:rFonts w:ascii="Arial" w:eastAsia="Arial" w:hAnsi="Arial" w:cs="Louguiya"/>
+          <w:color w:val="222222"/>
+          <w:sz w:val="24"/>
+          <w:szCs w:val="24"/>
+          <w:highlight w:val="white"/>
+          <w:rtl/>
+        </w:rPr>
+        <w:t xml:space="preserve"> المكلف بها بجدية ووفق التعليمات الصادرة؛</w:t>
       </w:r>
     </w:p>
     <w:p>
@@ -1323,18 +1455,7 @@
           <w:highlight w:val="white"/>
           <w:rtl/>
         </w:rPr>
-        <w:t xml:space="preserve">الالتزام </w:t>
-      </w:r>
-      <w:r>
-        <w:rPr>
-          <w:rFonts w:ascii="Arial" w:eastAsia="Arial" w:hAnsi="Arial" w:cs="Louguiya"/>
-          <w:color w:val="222222"/>
-          <w:sz w:val="24"/>
-          <w:szCs w:val="24"/>
-          <w:highlight w:val="white"/>
-          <w:rtl/>
-        </w:rPr>
-        <w:t>بالسرية المهنية وعدم استغلال المعلومات أو الوثائق؛</w:t>
+        <w:t>الالتزام بالسرية المهنية وعدم استغلال المعلومات أو الوثائق؛</w:t>
       </w:r>
     </w:p>
     <w:p>
@@ -1483,7 +1604,7 @@
           <w:highlight w:val="white"/>
           <w:rtl/>
         </w:rPr>
-        <w:t xml:space="preserve">صرف تعويض جزافي شهري قدره </w:t>
+        <w:t>صرف تعويض جزافي شهري قدره</w:t>
       </w:r>
       <w:r>
         <w:rPr>
@@ -1491,9 +1612,86 @@
           <w:color w:val="EE0000"/>
           <w:sz w:val="24"/>
           <w:szCs w:val="24"/>
-          <w:rtl/>
-        </w:rPr>
-        <w:t xml:space="preserve">عشرة </w:t>
+        </w:rPr>
+        <w:t xml:space="preserve"> </w:t>
+      </w:r>
+      <w:r>
+        <w:rPr>
+          <w:rFonts w:ascii="Arial" w:eastAsia="Arial" w:hAnsi="Arial" w:cs="Louguiya"/>
+          <w:color w:val="000000" w:themeColor="text1"/>
+          <w:sz w:val="24"/>
+          <w:szCs w:val="24"/>
+          <w:rtl/>
+        </w:rPr>
+        <w:fldChar w:fldCharType="begin"/>
+      </w:r>
+      <w:r>
+        <w:rPr>
+          <w:rFonts w:ascii="Arial" w:eastAsia="Arial" w:hAnsi="Arial" w:cs="Louguiya"/>
+          <w:color w:val="000000" w:themeColor="text1"/>
+          <w:sz w:val="24"/>
+          <w:szCs w:val="24"/>
+          <w:rtl/>
+        </w:rPr>
+        <w:instrText xml:space="preserve"> MERGEFIELD =amount \* MERGEFORMAT </w:instrText>
+      </w:r>
+      <w:r>
+        <w:rPr>
+          <w:rFonts w:ascii="Arial" w:eastAsia="Arial" w:hAnsi="Arial" w:cs="Louguiya"/>
+          <w:color w:val="000000" w:themeColor="text1"/>
+          <w:sz w:val="24"/>
+          <w:szCs w:val="24"/>
+          <w:rtl/>
+        </w:rPr>
+        <w:fldChar w:fldCharType="separate"/>
+      </w:r>
+      <w:r>
+        <w:rPr>
+          <w:rFonts w:ascii="Arial" w:eastAsia="Arial" w:hAnsi="Arial" w:cs="Louguiya"/>
+          <w:b/>
+          <w:bCs/>
+          <w:color w:val="000000" w:themeColor="text1"/>
+          <w:sz w:val="24"/>
+          <w:szCs w:val="24"/>
+          <w:rtl/>
+        </w:rPr>
+        <w:t>«=</w:t>
+      </w:r>
+      <w:proofErr w:type="spellStart"/>
+      <w:r>
+        <w:rPr>
+          <w:rFonts w:ascii="Arial" w:eastAsia="Arial" w:hAnsi="Arial" w:cs="Louguiya"/>
+          <w:b/>
+          <w:bCs/>
+          <w:color w:val="000000" w:themeColor="text1"/>
+          <w:sz w:val="24"/>
+          <w:szCs w:val="24"/>
+          <w:rtl/>
+        </w:rPr>
+        <w:t>amount</w:t>
+      </w:r>
+      <w:proofErr w:type="spellEnd"/>
+      <w:r>
+        <w:rPr>
+          <w:rFonts w:ascii="Arial" w:eastAsia="Arial" w:hAnsi="Arial" w:cs="Louguiya"/>
+          <w:b/>
+          <w:bCs/>
+          <w:color w:val="000000" w:themeColor="text1"/>
+          <w:sz w:val="24"/>
+          <w:szCs w:val="24"/>
+          <w:rtl/>
+        </w:rPr>
+        <w:t>»</w:t>
+      </w:r>
+      <w:r>
+        <w:rPr>
+          <w:rFonts w:ascii="Arial" w:eastAsia="Arial" w:hAnsi="Arial" w:cs="Louguiya"/>
+          <w:color w:val="000000" w:themeColor="text1"/>
+          <w:sz w:val="24"/>
+          <w:szCs w:val="24"/>
+          <w:rtl/>
+        </w:rPr>
+        <w:fldChar w:fldCharType="end"/>
       </w:r>
       <w:r>
         <w:rPr>
@@ -1503,13 +1701,78 @@
           <w:szCs w:val="24"/>
           <w:rtl/>
         </w:rPr>
-        <w:t>آلاف (</w:t>
-      </w:r>
-      <w:proofErr w:type="gramStart"/>
-      <w:r>
-        <w:rPr>
-          <w:rFonts w:ascii="Arial" w:eastAsia="Arial" w:hAnsi="Arial" w:cs="Louguiya"/>
-          <w:color w:val="EE0000"/>
+        <w:t xml:space="preserve"> </w:t>
+      </w:r>
+      <w:r>
+        <w:rPr>
+          <w:rFonts w:ascii="Arial" w:eastAsia="Arial" w:hAnsi="Arial" w:cs="Louguiya"/>
+          <w:color w:val="222222"/>
+          <w:sz w:val="24"/>
+          <w:szCs w:val="24"/>
+          <w:highlight w:val="white"/>
+          <w:rtl/>
+        </w:rPr>
+        <w:t>أوقية جديدة.</w:t>
+      </w:r>
+    </w:p>
+    <w:p>
+      <w:pPr>
+        <w:widowControl/>
+        <w:shd w:val="clear" w:color="auto" w:fill="FFFFFF"/>
+        <w:bidi/>
+        <w:rPr>
+          <w:rFonts w:ascii="Arial" w:eastAsia="Arial" w:hAnsi="Arial" w:cs="Louguiya"/>
+          <w:b/>
+          <w:bCs/>
+          <w:color w:val="222222"/>
+          <w:sz w:val="24"/>
+          <w:szCs w:val="24"/>
+          <w:highlight w:val="white"/>
+          <w:u w:val="single"/>
+        </w:rPr>
+      </w:pPr>
+    </w:p>
+    <w:p>
+      <w:pPr>
+        <w:widowControl/>
+        <w:shd w:val="clear" w:color="auto" w:fill="FFFFFF"/>
+        <w:bidi/>
+        <w:rPr>
+          <w:rFonts w:ascii="Arial" w:eastAsia="Arial" w:hAnsi="Arial" w:cs="Louguiya"/>
+          <w:color w:val="222222"/>
+          <w:sz w:val="24"/>
+          <w:szCs w:val="24"/>
+        </w:rPr>
+      </w:pPr>
+      <w:r>
+        <w:rPr>
+          <w:rFonts w:ascii="Arial" w:eastAsia="Arial" w:hAnsi="Arial" w:cs="Louguiya"/>
+          <w:b/>
+          <w:bCs/>
+          <w:color w:val="222222"/>
+          <w:sz w:val="24"/>
+          <w:szCs w:val="24"/>
+          <w:highlight w:val="white"/>
+          <w:u w:val="single"/>
+          <w:rtl/>
+        </w:rPr>
+        <w:t xml:space="preserve">المادة 5: </w:t>
+      </w:r>
+      <w:r>
+        <w:rPr>
+          <w:rFonts w:ascii="Arial" w:eastAsia="Arial" w:hAnsi="Arial" w:cs="Louguiya"/>
+          <w:color w:val="222222"/>
+          <w:sz w:val="24"/>
+          <w:szCs w:val="24"/>
+          <w:highlight w:val="white"/>
+          <w:rtl/>
+        </w:rPr>
+        <w:t xml:space="preserve">يبدأ سريان هذا العقد من </w:t>
+      </w:r>
+      <w:r>
+        <w:rPr>
+          <w:rFonts w:ascii="Arial" w:eastAsia="Arial" w:hAnsi="Arial" w:cs="Louguiya"/>
+          <w:color w:val="000000" w:themeColor="text1"/>
           <w:sz w:val="24"/>
           <w:szCs w:val="24"/>
           <w:rtl/>
@@ -1519,17 +1782,17 @@
       <w:r>
         <w:rPr>
           <w:rFonts w:ascii="Arial" w:eastAsia="Arial" w:hAnsi="Arial" w:cs="Louguiya"/>
-          <w:color w:val="EE0000"/>
-          <w:sz w:val="24"/>
-          <w:szCs w:val="24"/>
-          <w:rtl/>
-        </w:rPr>
-        <w:instrText xml:space="preserve"> MERGEFIELD =amount \* MERGEFORMAT </w:instrText>
-      </w:r>
-      <w:r>
-        <w:rPr>
-          <w:rFonts w:ascii="Arial" w:eastAsia="Arial" w:hAnsi="Arial" w:cs="Louguiya"/>
-          <w:color w:val="EE0000"/>
+          <w:color w:val="000000" w:themeColor="text1"/>
+          <w:sz w:val="24"/>
+          <w:szCs w:val="24"/>
+          <w:rtl/>
+        </w:rPr>
+        <w:instrText xml:space="preserve"> MERGEFIELD =start_date \* MERGEFORMAT </w:instrText>
+      </w:r>
+      <w:r>
+        <w:rPr>
+          <w:rFonts w:ascii="Arial" w:eastAsia="Arial" w:hAnsi="Arial" w:cs="Louguiya"/>
+          <w:color w:val="000000" w:themeColor="text1"/>
           <w:sz w:val="24"/>
           <w:szCs w:val="24"/>
           <w:rtl/>
@@ -1539,158 +1802,19 @@
       <w:r>
         <w:rPr>
           <w:rFonts w:ascii="Arial" w:eastAsia="Arial" w:hAnsi="Arial" w:cs="Louguiya"/>
-          <w:color w:val="EE0000"/>
-          <w:sz w:val="24"/>
-          <w:szCs w:val="24"/>
-          <w:rtl/>
-          <w:b/>
-          <w:bCs/>
-        </w:rPr>
-        <w:t>«=amount»</w:t>
-      </w:r>
-      <w:r>
-        <w:rPr>
-          <w:rFonts w:ascii="Arial" w:eastAsia="Arial" w:hAnsi="Arial" w:cs="Louguiya"/>
-          <w:color w:val="EE0000"/>
-          <w:sz w:val="24"/>
-          <w:szCs w:val="24"/>
-          <w:rtl/>
-        </w:rPr>
-        <w:fldChar w:fldCharType="end"/>
-      </w:r>
-      <w:r>
-        <w:rPr>
-          <w:rFonts w:ascii="Arial" w:eastAsia="Arial" w:hAnsi="Arial" w:cs="Louguiya"/>
-          <w:color w:val="EE0000"/>
-          <w:sz w:val="24"/>
-          <w:szCs w:val="24"/>
-          <w:rtl/>
-        </w:rPr>
-        <w:t xml:space="preserve"> أوقية</w:t>
-      </w:r>
-      <w:proofErr w:type="gramEnd"/>
-      <w:r>
-        <w:rPr>
-          <w:rFonts w:ascii="Arial" w:eastAsia="Arial" w:hAnsi="Arial" w:cs="Louguiya"/>
-          <w:color w:val="222222"/>
-          <w:sz w:val="24"/>
-          <w:szCs w:val="24"/>
-          <w:rtl/>
-        </w:rPr>
-        <w:t xml:space="preserve"> </w:t>
-      </w:r>
-      <w:r>
-        <w:rPr>
-          <w:rFonts w:ascii="Arial" w:eastAsia="Arial" w:hAnsi="Arial" w:cs="Louguiya"/>
-          <w:color w:val="222222"/>
-          <w:sz w:val="24"/>
-          <w:szCs w:val="24"/>
-          <w:highlight w:val="white"/>
-          <w:rtl/>
-        </w:rPr>
-        <w:t>أوقية جديدة.</w:t>
-      </w:r>
-    </w:p>
-    <w:p>
-      <w:pPr>
-        <w:widowControl/>
-        <w:shd w:val="clear" w:color="auto" w:fill="FFFFFF"/>
-        <w:bidi/>
-        <w:rPr>
-          <w:rFonts w:ascii="Arial" w:eastAsia="Arial" w:hAnsi="Arial" w:cs="Louguiya"/>
-          <w:b/>
-          <w:bCs/>
-          <w:color w:val="222222"/>
-          <w:sz w:val="24"/>
-          <w:szCs w:val="24"/>
-          <w:highlight w:val="white"/>
-          <w:u w:val="single"/>
-        </w:rPr>
-      </w:pPr>
-    </w:p>
-    <w:p>
-      <w:pPr>
-        <w:widowControl/>
-        <w:shd w:val="clear" w:color="auto" w:fill="FFFFFF"/>
-        <w:bidi/>
-        <w:rPr>
-          <w:rFonts w:ascii="Arial" w:eastAsia="Arial" w:hAnsi="Arial" w:cs="Louguiya"/>
-          <w:color w:val="222222"/>
-          <w:sz w:val="24"/>
-          <w:szCs w:val="24"/>
-        </w:rPr>
-      </w:pPr>
-      <w:r>
-        <w:rPr>
-          <w:rFonts w:ascii="Arial" w:eastAsia="Arial" w:hAnsi="Arial" w:cs="Louguiya"/>
-          <w:b/>
-          <w:bCs/>
-          <w:color w:val="222222"/>
-          <w:sz w:val="24"/>
-          <w:szCs w:val="24"/>
-          <w:highlight w:val="white"/>
-          <w:u w:val="single"/>
-          <w:rtl/>
-        </w:rPr>
-        <w:t xml:space="preserve">المادة 5: </w:t>
-      </w:r>
-      <w:r>
-        <w:rPr>
-          <w:rFonts w:ascii="Arial" w:eastAsia="Arial" w:hAnsi="Arial" w:cs="Louguiya"/>
-          <w:color w:val="222222"/>
-          <w:sz w:val="24"/>
-          <w:szCs w:val="24"/>
-          <w:highlight w:val="white"/>
-          <w:rtl/>
-        </w:rPr>
-        <w:t xml:space="preserve">يبدأ سريان هذا العقد من </w:t>
-      </w:r>
-      <w:r>
-        <w:rPr>
-          <w:rFonts w:ascii="Arial" w:eastAsia="Arial" w:hAnsi="Arial" w:cs="Louguiya"/>
-          <w:color w:val="EE0000"/>
-          <w:sz w:val="24"/>
-          <w:szCs w:val="24"/>
-          <w:rtl/>
-        </w:rPr>
-        <w:fldChar w:fldCharType="begin"/>
-      </w:r>
-      <w:r>
-        <w:rPr>
-          <w:rFonts w:ascii="Arial" w:eastAsia="Arial" w:hAnsi="Arial" w:cs="Louguiya"/>
-          <w:color w:val="EE0000"/>
-          <w:sz w:val="24"/>
-          <w:szCs w:val="24"/>
-          <w:rtl/>
-        </w:rPr>
-        <w:instrText xml:space="preserve"> MERGEFIELD =start_date \* MERGEFORMAT </w:instrText>
-      </w:r>
-      <w:r>
-        <w:rPr>
-          <w:rFonts w:ascii="Arial" w:eastAsia="Arial" w:hAnsi="Arial" w:cs="Louguiya"/>
-          <w:color w:val="EE0000"/>
-          <w:sz w:val="24"/>
-          <w:szCs w:val="24"/>
-          <w:rtl/>
-        </w:rPr>
-        <w:fldChar w:fldCharType="separate"/>
-      </w:r>
-      <w:r>
-        <w:rPr>
-          <w:rFonts w:ascii="Arial" w:eastAsia="Arial" w:hAnsi="Arial" w:cs="Louguiya"/>
-          <w:color w:val="EE0000"/>
-          <w:sz w:val="24"/>
-          <w:szCs w:val="24"/>
-          <w:rtl/>
-          <w:b/>
-          <w:bCs/>
+          <w:b/>
+          <w:bCs/>
+          <w:color w:val="000000" w:themeColor="text1"/>
+          <w:sz w:val="24"/>
+          <w:szCs w:val="24"/>
+          <w:rtl/>
         </w:rPr>
         <w:t>«=start_date»</w:t>
       </w:r>
       <w:r>
         <w:rPr>
           <w:rFonts w:ascii="Arial" w:eastAsia="Arial" w:hAnsi="Arial" w:cs="Louguiya"/>
-          <w:color w:val="EE0000"/>
+          <w:color w:val="000000" w:themeColor="text1"/>
           <w:sz w:val="24"/>
           <w:szCs w:val="24"/>
           <w:rtl/>
@@ -2691,12 +2815,12 @@
       <w:r>
         <w:rPr>
           <w:rFonts w:ascii="Arial" w:eastAsia="Arial" w:hAnsi="Arial" w:cs="Louguiya"/>
-          <w:color w:val="222222"/>
-          <w:sz w:val="24"/>
-          <w:szCs w:val="24"/>
-          <w:rtl/>
-          <w:b/>
-          <w:bCs/>
+          <w:b/>
+          <w:bCs/>
+          <w:color w:val="222222"/>
+          <w:sz w:val="24"/>
+          <w:szCs w:val="24"/>
+          <w:rtl/>
         </w:rPr>
         <w:t>«=signing_date»</w:t>
       </w:r>
@@ -2854,12 +2978,25 @@
           <w:highlight w:val="white"/>
           <w:rtl/>
         </w:rPr>
-        <w:t>الطرف الثاني</w:t>
-      </w:r>
-      <w:r>
-        <w:rPr>
-          <w:rFonts w:ascii="Arial" w:eastAsia="Arial" w:hAnsi="Arial" w:cs="Louguiya"/>
-          <w:color w:val="222222"/>
+        <w:t xml:space="preserve">الطرف </w:t>
+      </w:r>
+      <w:r>
+        <w:rPr>
+          <w:rFonts w:ascii="Arial" w:eastAsia="Arial" w:hAnsi="Arial" w:cs="Louguiya"/>
+          <w:b/>
+          <w:bCs/>
+          <w:color w:val="000000" w:themeColor="text1"/>
+          <w:sz w:val="24"/>
+          <w:szCs w:val="24"/>
+          <w:highlight w:val="white"/>
+          <w:rtl/>
+        </w:rPr>
+        <w:t>الثاني</w:t>
+      </w:r>
+      <w:r>
+        <w:rPr>
+          <w:rFonts w:ascii="Arial" w:eastAsia="Arial" w:hAnsi="Arial" w:cs="Louguiya"/>
+          <w:color w:val="000000" w:themeColor="text1"/>
           <w:sz w:val="24"/>
           <w:szCs w:val="24"/>
           <w:highlight w:val="white"/>
@@ -2870,7 +3007,7 @@
       <w:r>
         <w:rPr>
           <w:rFonts w:ascii="Arial" w:eastAsia="Arial" w:hAnsi="Arial" w:cs="Louguiya"/>
-          <w:color w:val="EE0000"/>
+          <w:color w:val="000000" w:themeColor="text1"/>
           <w:sz w:val="24"/>
           <w:szCs w:val="24"/>
           <w:rtl/>
@@ -2880,7 +3017,7 @@
       <w:r>
         <w:rPr>
           <w:rFonts w:ascii="Arial" w:eastAsia="Arial" w:hAnsi="Arial" w:cs="Louguiya"/>
-          <w:color w:val="EE0000"/>
+          <w:color w:val="000000" w:themeColor="text1"/>
           <w:sz w:val="24"/>
           <w:szCs w:val="24"/>
           <w:rtl/>
@@ -2890,7 +3027,7 @@
       <w:r>
         <w:rPr>
           <w:rFonts w:ascii="Arial" w:eastAsia="Arial" w:hAnsi="Arial" w:cs="Louguiya"/>
-          <w:color w:val="EE0000"/>
+          <w:color w:val="000000" w:themeColor="text1"/>
           <w:sz w:val="24"/>
           <w:szCs w:val="24"/>
           <w:rtl/>
@@ -2900,19 +3037,19 @@
       <w:r>
         <w:rPr>
           <w:rFonts w:ascii="Arial" w:eastAsia="Arial" w:hAnsi="Arial" w:cs="Louguiya"/>
-          <w:color w:val="EE0000"/>
-          <w:sz w:val="24"/>
-          <w:szCs w:val="24"/>
-          <w:rtl/>
-          <w:b/>
-          <w:bCs/>
+          <w:b/>
+          <w:bCs/>
+          <w:color w:val="000000" w:themeColor="text1"/>
+          <w:sz w:val="24"/>
+          <w:szCs w:val="24"/>
+          <w:rtl/>
         </w:rPr>
         <w:t>«=job_title»</w:t>
       </w:r>
       <w:r>
         <w:rPr>
           <w:rFonts w:ascii="Arial" w:eastAsia="Arial" w:hAnsi="Arial" w:cs="Louguiya"/>
-          <w:color w:val="EE0000"/>
+          <w:color w:val="000000" w:themeColor="text1"/>
           <w:sz w:val="24"/>
           <w:szCs w:val="24"/>
           <w:rtl/>
@@ -2923,7 +3060,7 @@
       <w:r>
         <w:rPr>
           <w:rFonts w:ascii="Arial" w:eastAsia="Arial" w:hAnsi="Arial" w:cs="Louguiya" w:hint="cs"/>
-          <w:color w:val="EE0000"/>
+          <w:color w:val="000000" w:themeColor="text1"/>
           <w:sz w:val="24"/>
           <w:szCs w:val="24"/>
           <w:rtl/>
@@ -2933,7 +3070,7 @@
       <w:r>
         <w:rPr>
           <w:rFonts w:ascii="Arial" w:eastAsia="Arial" w:hAnsi="Arial" w:cs="Louguiya"/>
-          <w:color w:val="EE0000"/>
+          <w:color w:val="000000" w:themeColor="text1"/>
           <w:sz w:val="24"/>
           <w:szCs w:val="24"/>
         </w:rPr>
@@ -2942,7 +3079,7 @@
       <w:r>
         <w:rPr>
           <w:rFonts w:ascii="Arial" w:eastAsia="Arial" w:hAnsi="Arial" w:cs="Louguiya" w:hint="cs"/>
-          <w:color w:val="EE0000"/>
+          <w:color w:val="000000" w:themeColor="text1"/>
           <w:sz w:val="24"/>
           <w:szCs w:val="24"/>
           <w:rtl/>
@@ -2953,7 +3090,7 @@
       <w:r>
         <w:rPr>
           <w:rFonts w:ascii="Arial" w:eastAsia="Arial" w:hAnsi="Arial" w:cs="Louguiya" w:hint="cs"/>
-          <w:color w:val="EE0000"/>
+          <w:color w:val="000000" w:themeColor="text1"/>
           <w:sz w:val="24"/>
           <w:szCs w:val="24"/>
           <w:rtl/>
@@ -2964,7 +3101,7 @@
       <w:r>
         <w:rPr>
           <w:rFonts w:ascii="Arial" w:eastAsia="Arial" w:hAnsi="Arial" w:cs="Louguiya" w:hint="cs"/>
-          <w:color w:val="EE0000"/>
+          <w:color w:val="000000" w:themeColor="text1"/>
           <w:sz w:val="24"/>
           <w:szCs w:val="24"/>
           <w:rtl/>
@@ -2974,7 +3111,7 @@
       <w:r>
         <w:rPr>
           <w:rFonts w:ascii="Arial" w:eastAsia="Arial" w:hAnsi="Arial" w:cs="Louguiya"/>
-          <w:color w:val="EE0000"/>
+          <w:color w:val="000000" w:themeColor="text1"/>
           <w:sz w:val="24"/>
           <w:szCs w:val="24"/>
         </w:rPr>
@@ -3053,12 +3190,12 @@
       <w:r>
         <w:rPr>
           <w:rFonts w:ascii="Arial" w:eastAsia="Arial" w:hAnsi="Arial" w:cs="Louguiya"/>
-          <w:color w:val="222222"/>
-          <w:sz w:val="24"/>
-          <w:szCs w:val="24"/>
-          <w:rtl/>
-          <w:b/>
-          <w:bCs/>
+          <w:b/>
+          <w:bCs/>
+          <w:color w:val="222222"/>
+          <w:sz w:val="24"/>
+          <w:szCs w:val="24"/>
+          <w:rtl/>
         </w:rPr>
         <w:t>«=employee_name_fr»</w:t>
       </w:r>
@@ -3337,204 +3474,6 @@
           <w:highlight w:val="white"/>
         </w:rPr>
       </w:pPr>
-    </w:p>
-    <w:p>
-      <w:pPr>
-        <w:widowControl/>
-        <w:shd w:val="clear" w:color="auto" w:fill="FFFFFF"/>
-        <w:bidi/>
-        <w:spacing w:before="120"/>
-        <w:jc w:val="left"/>
-        <w:rPr>
-          <w:rFonts w:ascii="Arial" w:eastAsia="Arial" w:hAnsi="Arial" w:cs="Louguiya"/>
-          <w:color w:val="222222"/>
-          <w:sz w:val="24"/>
-          <w:szCs w:val="24"/>
-          <w:highlight w:val="white"/>
-        </w:rPr>
-      </w:pPr>
-    </w:p>
-    <w:p>
-      <w:pPr>
-        <w:widowControl/>
-        <w:shd w:val="clear" w:color="auto" w:fill="FFFFFF"/>
-        <w:bidi/>
-        <w:spacing w:before="120"/>
-        <w:jc w:val="left"/>
-        <w:rPr>
-          <w:rFonts w:ascii="Arial" w:eastAsia="Arial" w:hAnsi="Arial" w:cs="Louguiya"/>
-          <w:color w:val="222222"/>
-          <w:sz w:val="24"/>
-          <w:szCs w:val="24"/>
-          <w:highlight w:val="white"/>
-        </w:rPr>
-      </w:pPr>
-    </w:p>
-    <w:p>
-      <w:pPr>
-        <w:widowControl/>
-        <w:shd w:val="clear" w:color="auto" w:fill="FFFFFF"/>
-        <w:bidi/>
-        <w:spacing w:before="120"/>
-        <w:jc w:val="left"/>
-        <w:rPr>
-          <w:rFonts w:ascii="Arial" w:eastAsia="Arial" w:hAnsi="Arial" w:cs="Louguiya"/>
-          <w:color w:val="222222"/>
-          <w:sz w:val="24"/>
-          <w:szCs w:val="24"/>
-          <w:highlight w:val="white"/>
-        </w:rPr>
-      </w:pPr>
-    </w:p>
-    <w:p>
-      <w:pPr>
-        <w:widowControl/>
-        <w:shd w:val="clear" w:color="auto" w:fill="FFFFFF"/>
-        <w:bidi/>
-        <w:spacing w:before="120"/>
-        <w:jc w:val="left"/>
-        <w:rPr>
-          <w:rFonts w:ascii="Arial" w:eastAsia="Arial" w:hAnsi="Arial" w:cs="Louguiya"/>
-          <w:b/>
-          <w:bCs/>
-          <w:color w:val="222222"/>
-          <w:sz w:val="24"/>
-          <w:szCs w:val="24"/>
-        </w:rPr>
-      </w:pPr>
-      <w:r>
-        <w:rPr>
-          <w:rFonts w:ascii="Arial" w:eastAsia="Arial" w:hAnsi="Arial" w:cs="Louguiya"/>
-          <w:b/>
-          <w:bCs/>
-          <w:color w:val="222222"/>
-          <w:sz w:val="24"/>
-          <w:szCs w:val="24"/>
-          <w:highlight w:val="white"/>
-          <w:rtl/>
-        </w:rPr>
-        <w:lastRenderedPageBreak/>
-        <w:t xml:space="preserve">الجمهورية الإسلامية الموريتانية                               </w:t>
-      </w:r>
-      <w:r>
-        <w:rPr>
-          <w:rFonts w:ascii="Arial" w:eastAsia="Arial" w:hAnsi="Arial" w:cs="Louguiya"/>
-          <w:b/>
-          <w:bCs/>
-          <w:color w:val="222222"/>
-          <w:sz w:val="24"/>
-          <w:szCs w:val="24"/>
-          <w:highlight w:val="white"/>
-        </w:rPr>
-        <w:t xml:space="preserve">                                   </w:t>
-      </w:r>
-      <w:r>
-        <w:rPr>
-          <w:rFonts w:ascii="Arial" w:eastAsia="Arial" w:hAnsi="Arial" w:cs="Louguiya"/>
-          <w:b/>
-          <w:bCs/>
-          <w:color w:val="222222"/>
-          <w:sz w:val="24"/>
-          <w:szCs w:val="24"/>
-          <w:highlight w:val="white"/>
-          <w:rtl/>
-        </w:rPr>
-        <w:t xml:space="preserve">               </w:t>
-      </w:r>
-      <w:r>
-        <w:rPr>
-          <w:rFonts w:ascii="Arial" w:eastAsia="Arial" w:hAnsi="Arial" w:cs="Louguiya" w:hint="cs"/>
-          <w:b/>
-          <w:bCs/>
-          <w:color w:val="222222"/>
-          <w:sz w:val="24"/>
-          <w:szCs w:val="24"/>
-          <w:highlight w:val="white"/>
-          <w:rtl/>
-        </w:rPr>
-        <w:t xml:space="preserve">                      </w:t>
-      </w:r>
-      <w:r>
-        <w:rPr>
-          <w:rFonts w:ascii="Arial" w:eastAsia="Arial" w:hAnsi="Arial" w:cs="Louguiya"/>
-          <w:b/>
-          <w:bCs/>
-          <w:color w:val="222222"/>
-          <w:sz w:val="24"/>
-          <w:szCs w:val="24"/>
-          <w:highlight w:val="white"/>
-          <w:rtl/>
-        </w:rPr>
-        <w:t xml:space="preserve">                </w:t>
-      </w:r>
-      <w:r>
-        <w:rPr>
-          <w:rFonts w:ascii="Arial" w:eastAsia="Arial" w:hAnsi="Arial" w:cs="Louguiya"/>
-          <w:color w:val="222222"/>
-          <w:sz w:val="24"/>
-          <w:szCs w:val="24"/>
-          <w:highlight w:val="white"/>
-          <w:rtl/>
-        </w:rPr>
-        <w:t>شرف – إخاء – عدل</w:t>
-      </w:r>
-    </w:p>
-    <w:p>
-      <w:pPr>
-        <w:widowControl/>
-        <w:shd w:val="clear" w:color="auto" w:fill="FFFFFF"/>
-        <w:bidi/>
-        <w:spacing w:before="120"/>
-        <w:jc w:val="left"/>
-        <w:rPr>
-          <w:rFonts w:ascii="Arial" w:eastAsia="Arial" w:hAnsi="Arial" w:cs="Louguiya"/>
-          <w:b/>
-          <w:bCs/>
-          <w:color w:val="222222"/>
-          <w:sz w:val="24"/>
-          <w:szCs w:val="24"/>
-        </w:rPr>
-      </w:pPr>
-      <w:r>
-        <w:rPr>
-          <w:rFonts w:ascii="Arial" w:eastAsia="Arial" w:hAnsi="Arial" w:cs="Louguiya"/>
-          <w:b/>
-          <w:bCs/>
-          <w:color w:val="222222"/>
-          <w:sz w:val="24"/>
-          <w:szCs w:val="24"/>
-          <w:highlight w:val="white"/>
-          <w:rtl/>
-        </w:rPr>
-        <w:t>وزارة الشؤون الإسلامية والتعليم الأصلي</w:t>
-      </w:r>
-    </w:p>
-    <w:p>
-      <w:pPr>
-        <w:widowControl/>
-        <w:shd w:val="clear" w:color="auto" w:fill="FFFFFF"/>
-        <w:bidi/>
-        <w:spacing w:before="120"/>
-        <w:jc w:val="left"/>
-        <w:rPr>
-          <w:rFonts w:ascii="Arial" w:eastAsia="Arial" w:hAnsi="Arial" w:cs="Louguiya"/>
-          <w:color w:val="222222"/>
-          <w:sz w:val="24"/>
-          <w:szCs w:val="24"/>
-          <w:highlight w:val="white"/>
-        </w:rPr>
-      </w:pPr>
-      <w:r>
-        <w:rPr>
-          <w:rFonts w:ascii="Arial" w:eastAsia="Arial" w:hAnsi="Arial" w:cs="Louguiya"/>
-          <w:color w:val="222222"/>
-          <w:sz w:val="24"/>
-          <w:szCs w:val="24"/>
-          <w:highlight w:val="white"/>
-          <w:rtl/>
-        </w:rPr>
-        <w:t xml:space="preserve">مشروع دعم التعليم الأصلي في المناطق الاقل حظا في التعليم </w:t>
-      </w:r>
     </w:p>
     <w:p>
       <w:pPr>
@@ -4577,7 +4516,7 @@
       <w:lvlText w:val="%1."/>
       <w:lvlJc w:val="left"/>
       <w:pPr>
-        <w:ind w:left="720" w:hanging="720"/>
+        <w:ind w:left="1571" w:hanging="720"/>
       </w:pPr>
     </w:lvl>
     <w:lvl w:ilvl="1">
@@ -5089,7 +5028,7 @@
     <w:name w:val="Normal"/>
     <w:qFormat/>
   </w:style>
-  <w:style w:type="paragraph" w:styleId="Titre1">
+  <w:style w:type="paragraph" w:styleId="Heading1">
     <w:name w:val="heading 1"/>
     <w:basedOn w:val="Normal"/>
     <w:next w:val="Normal"/>
@@ -5108,7 +5047,7 @@
       <w:szCs w:val="48"/>
     </w:rPr>
   </w:style>
-  <w:style w:type="paragraph" w:styleId="Titre2">
+  <w:style w:type="paragraph" w:styleId="Heading2">
     <w:name w:val="heading 2"/>
     <w:basedOn w:val="Normal"/>
     <w:next w:val="Normal"/>
@@ -5129,7 +5068,7 @@
       <w:szCs w:val="36"/>
     </w:rPr>
   </w:style>
-  <w:style w:type="paragraph" w:styleId="Titre3">
+  <w:style w:type="paragraph" w:styleId="Heading3">
     <w:name w:val="heading 3"/>
     <w:basedOn w:val="Normal"/>
     <w:next w:val="Normal"/>
@@ -5150,7 +5089,7 @@
       <w:szCs w:val="28"/>
     </w:rPr>
   </w:style>
-  <w:style w:type="paragraph" w:styleId="Titre4">
+  <w:style w:type="paragraph" w:styleId="Heading4">
     <w:name w:val="heading 4"/>
     <w:basedOn w:val="Normal"/>
     <w:next w:val="Normal"/>
@@ -5171,7 +5110,7 @@
       <w:szCs w:val="24"/>
     </w:rPr>
   </w:style>
-  <w:style w:type="paragraph" w:styleId="Titre5">
+  <w:style w:type="paragraph" w:styleId="Heading5">
     <w:name w:val="heading 5"/>
     <w:basedOn w:val="Normal"/>
     <w:next w:val="Normal"/>
@@ -5192,7 +5131,7 @@
       <w:szCs w:val="22"/>
     </w:rPr>
   </w:style>
-  <w:style w:type="paragraph" w:styleId="Titre6">
+  <w:style w:type="paragraph" w:styleId="Heading6">
     <w:name w:val="heading 6"/>
     <w:basedOn w:val="Normal"/>
     <w:next w:val="Normal"/>
@@ -5213,13 +5152,13 @@
       <w:szCs w:val="20"/>
     </w:rPr>
   </w:style>
-  <w:style w:type="character" w:default="1" w:styleId="Policepardfaut">
+  <w:style w:type="character" w:default="1" w:styleId="DefaultParagraphFont">
     <w:name w:val="Default Paragraph Font"/>
     <w:uiPriority w:val="1"/>
     <w:semiHidden/>
     <w:unhideWhenUsed/>
   </w:style>
-  <w:style w:type="table" w:default="1" w:styleId="TableauNormal">
+  <w:style w:type="table" w:default="1" w:styleId="TableNormal">
     <w:name w:val="Normal Table"/>
     <w:uiPriority w:val="99"/>
     <w:semiHidden/>
@@ -5234,13 +5173,13 @@
       </w:tblCellMar>
     </w:tblPr>
   </w:style>
-  <w:style w:type="numbering" w:default="1" w:styleId="Aucuneliste">
+  <w:style w:type="numbering" w:default="1" w:styleId="NoList">
     <w:name w:val="No List"/>
     <w:uiPriority w:val="99"/>
     <w:semiHidden/>
     <w:unhideWhenUsed/>
   </w:style>
-  <w:style w:type="table" w:customStyle="1" w:styleId="TableNormal">
+  <w:style w:type="table" w:customStyle="1" w:styleId="TableNormal0">
     <w:name w:val="TableNormal"/>
     <w:tblPr>
       <w:tblCellMar>
@@ -5251,7 +5190,7 @@
       </w:tblCellMar>
     </w:tblPr>
   </w:style>
-  <w:style w:type="paragraph" w:styleId="Titre">
+  <w:style w:type="paragraph" w:styleId="Title">
     <w:name w:val="Title"/>
     <w:basedOn w:val="Normal"/>
     <w:next w:val="Normal"/>
@@ -5269,7 +5208,7 @@
       <w:szCs w:val="72"/>
     </w:rPr>
   </w:style>
-  <w:style w:type="paragraph" w:styleId="Sous-titre">
+  <w:style w:type="paragraph" w:styleId="Subtitle">
     <w:name w:val="Subtitle"/>
     <w:basedOn w:val="Normal"/>
     <w:next w:val="Normal"/>
@@ -5288,6 +5227,17 @@
       <w:sz w:val="48"/>
       <w:szCs w:val="48"/>
     </w:rPr>
+  </w:style>
+  <w:style w:type="paragraph" w:styleId="ListParagraph">
+    <w:name w:val="List Paragraph"/>
+    <w:basedOn w:val="Normal"/>
+    <w:uiPriority w:val="34"/>
+    <w:qFormat/>
+    <w:rsid w:val="001A21AF"/>
+    <w:pPr>
+      <w:ind w:left="720"/>
+      <w:contextualSpacing/>
+    </w:pPr>
   </w:style>
 </w:styles>
 </file>

</xml_diff>

<commit_message>
Update CDD and CDI contract templates
</commit_message>
<xml_diff>
--- a/backend/lib/templates/contract_cdd.docx
+++ b/backend/lib/templates/contract_cdd.docx
@@ -202,6 +202,17 @@
           <w:color w:val="222222"/>
           <w:sz w:val="24"/>
           <w:szCs w:val="24"/>
+        </w:rPr>
+        <w:t xml:space="preserve"> </w:t>
+      </w:r>
+      <w:r>
+        <w:rPr>
+          <w:rFonts w:ascii="Arial" w:eastAsia="Arial" w:hAnsi="Arial" w:cs="Louguiya"/>
+          <w:b/>
+          <w:bCs/>
+          <w:color w:val="222222"/>
+          <w:sz w:val="24"/>
+          <w:szCs w:val="24"/>
           <w:rtl/>
         </w:rPr>
         <w:fldChar w:fldCharType="begin"/>
@@ -240,7 +251,33 @@
           <w:szCs w:val="24"/>
           <w:rtl/>
         </w:rPr>
-        <w:t>«=contract_number»</w:t>
+        <w:t>«=</w:t>
+      </w:r>
+      <w:proofErr w:type="spellStart"/>
+      <w:r>
+        <w:rPr>
+          <w:rFonts w:ascii="Arial" w:eastAsia="Arial" w:hAnsi="Arial" w:cs="Louguiya"/>
+          <w:b/>
+          <w:bCs/>
+          <w:color w:val="222222"/>
+          <w:sz w:val="24"/>
+          <w:szCs w:val="24"/>
+          <w:rtl/>
+        </w:rPr>
+        <w:t>contract_number</w:t>
+      </w:r>
+      <w:proofErr w:type="spellEnd"/>
+      <w:r>
+        <w:rPr>
+          <w:rFonts w:ascii="Arial" w:eastAsia="Arial" w:hAnsi="Arial" w:cs="Louguiya"/>
+          <w:b/>
+          <w:bCs/>
+          <w:color w:val="222222"/>
+          <w:sz w:val="24"/>
+          <w:szCs w:val="24"/>
+          <w:rtl/>
+        </w:rPr>
+        <w:t>»</w:t>
       </w:r>
       <w:r>
         <w:rPr>
@@ -253,6 +290,17 @@
           <w:rtl/>
         </w:rPr>
         <w:fldChar w:fldCharType="end"/>
+      </w:r>
+      <w:r>
+        <w:rPr>
+          <w:rFonts w:ascii="Arial" w:eastAsia="Arial" w:hAnsi="Arial" w:cs="Louguiya"/>
+          <w:b/>
+          <w:bCs/>
+          <w:color w:val="222222"/>
+          <w:sz w:val="24"/>
+          <w:szCs w:val="24"/>
+        </w:rPr>
+        <w:t xml:space="preserve"> </w:t>
       </w:r>
       <w:r>
         <w:rPr>
@@ -1064,17 +1112,52 @@
           <w:szCs w:val="24"/>
           <w:rtl/>
         </w:rPr>
-        <w:t>«=job_title»</w:t>
-      </w:r>
-      <w:r>
-        <w:rPr>
-          <w:rFonts w:ascii="Arial" w:eastAsia="Arial" w:hAnsi="Arial" w:cs="Louguiya"/>
+        <w:t>«=</w:t>
+      </w:r>
+      <w:proofErr w:type="spellStart"/>
+      <w:r>
+        <w:rPr>
+          <w:rFonts w:ascii="Arial" w:eastAsia="Arial" w:hAnsi="Arial" w:cs="Louguiya"/>
+          <w:b/>
+          <w:bCs/>
           <w:color w:val="000000" w:themeColor="text1"/>
           <w:sz w:val="24"/>
           <w:szCs w:val="24"/>
           <w:rtl/>
         </w:rPr>
+        <w:t>job_title</w:t>
+      </w:r>
+      <w:proofErr w:type="spellEnd"/>
+      <w:r>
+        <w:rPr>
+          <w:rFonts w:ascii="Arial" w:eastAsia="Arial" w:hAnsi="Arial" w:cs="Louguiya"/>
+          <w:b/>
+          <w:bCs/>
+          <w:color w:val="000000" w:themeColor="text1"/>
+          <w:sz w:val="24"/>
+          <w:szCs w:val="24"/>
+          <w:rtl/>
+        </w:rPr>
+        <w:t>»</w:t>
+      </w:r>
+      <w:r>
+        <w:rPr>
+          <w:rFonts w:ascii="Arial" w:eastAsia="Arial" w:hAnsi="Arial" w:cs="Louguiya"/>
+          <w:color w:val="000000" w:themeColor="text1"/>
+          <w:sz w:val="24"/>
+          <w:szCs w:val="24"/>
+          <w:rtl/>
+        </w:rPr>
         <w:fldChar w:fldCharType="end"/>
+      </w:r>
+      <w:r>
+        <w:rPr>
+          <w:rFonts w:ascii="Arial" w:eastAsia="Arial" w:hAnsi="Arial" w:cs="Louguiya"/>
+          <w:color w:val="000000" w:themeColor="text1"/>
+          <w:sz w:val="24"/>
+          <w:szCs w:val="24"/>
+        </w:rPr>
+        <w:t xml:space="preserve"> </w:t>
       </w:r>
       <w:r>
         <w:rPr>

</xml_diff>

<commit_message>
Fix CDD contract signature block: reliable alignment + director signature
The party names at the bottom of the contract were positioned with
literal space-padding, which only lined up under their labels for the
exact name length the spacing was tuned for. Replaced it with a proper
borderless table (two centered cells) so both names stay correctly
aligned under "الطرف الأول" / "الطرف الثاني" regardless of length.

Also reverts employee_name_fr back to the employee's Arabic name (per
the documented convention in operating rules) — a previous change had
switched it to the French transliteration, which doesn't belong in the
Arabic signing section — and embeds the director's signature (cleaned,
transparent background) above his printed name.
</commit_message>
<xml_diff>
--- a/backend/lib/templates/contract_cdd.docx
+++ b/backend/lib/templates/contract_cdd.docx
@@ -1479,161 +1479,187 @@
         </w:r>
       </w:fldSimple>
     </w:p>
-    <w:p>
-      <w:pPr>
-        <w:widowControl/>
-        <w:shd w:val="clear" w:color="auto" w:fill="FFFFFF"/>
-        <w:bidi/>
-        <w:spacing w:before="120"/>
-        <w:jc w:val="left"/>
-        <w:rPr>
-          <w:rFonts w:ascii="Arial" w:eastAsia="Arial" w:hAnsi="Arial" w:cs="Arial"/>
-          <w:sz w:val="26"/>
-          <w:szCs w:val="26"/>
-        </w:rPr>
-      </w:pPr>
-      <w:r>
-        <w:rPr>
-          <w:rFonts w:ascii="Arial" w:eastAsia="Arial" w:hAnsi="Arial" w:cs="Arial"/>
-          <w:sz w:val="26"/>
-          <w:szCs w:val="26"/>
-          <w:rtl/>
-        </w:rPr>
-        <w:t>ا</w:t>
-      </w:r>
-      <w:r>
-        <w:rPr>
-          <w:rFonts w:ascii="Arial" w:eastAsia="Arial" w:hAnsi="Arial" w:cs="Arial"/>
-          <w:b/>
-          <w:bCs/>
-          <w:sz w:val="26"/>
-          <w:szCs w:val="26"/>
-          <w:rtl/>
-        </w:rPr>
-        <w:t>لطرف الأول (</w:t>
-      </w:r>
-      <w:r>
-        <w:rPr>
-          <w:rFonts w:ascii="Arial" w:eastAsia="Arial" w:hAnsi="Arial" w:cs="Arial"/>
-          <w:sz w:val="26"/>
-          <w:szCs w:val="26"/>
-          <w:rtl/>
-        </w:rPr>
-        <w:t xml:space="preserve">منسق برنامج التعليم </w:t>
-      </w:r>
-      <w:r>
-        <w:rPr>
-          <w:rFonts w:ascii="Arial" w:eastAsia="Arial" w:hAnsi="Arial" w:cs="Arial" w:hint="cs"/>
-          <w:sz w:val="26"/>
-          <w:szCs w:val="26"/>
-          <w:rtl/>
-        </w:rPr>
-        <w:t xml:space="preserve">الأصلي)  </w:t>
-      </w:r>
-      <w:r>
-        <w:rPr>
-          <w:rFonts w:ascii="Arial" w:eastAsia="Arial" w:hAnsi="Arial" w:cs="Arial"/>
-          <w:sz w:val="26"/>
-          <w:szCs w:val="26"/>
-          <w:rtl/>
-        </w:rPr>
-        <w:t xml:space="preserve">                                                      </w:t>
-      </w:r>
-      <w:r>
-        <w:rPr>
-          <w:rFonts w:ascii="Arial" w:eastAsia="Arial" w:hAnsi="Arial" w:cs="Arial"/>
-          <w:b/>
-          <w:bCs/>
-          <w:sz w:val="26"/>
-          <w:szCs w:val="26"/>
-          <w:rtl/>
-        </w:rPr>
-        <w:t>الطرف الثاني</w:t>
-      </w:r>
-      <w:r>
-        <w:rPr>
-          <w:rFonts w:ascii="Arial" w:eastAsia="Arial" w:hAnsi="Arial" w:cs="Arial"/>
-          <w:sz w:val="26"/>
-          <w:szCs w:val="26"/>
-          <w:rtl/>
-        </w:rPr>
-        <w:t xml:space="preserve">  (شيخ المحظرة)</w:t>
-      </w:r>
-    </w:p>
-    <w:p>
-      <w:pPr>
-        <w:widowControl/>
-        <w:shd w:val="clear" w:color="auto" w:fill="FFFFFF"/>
-        <w:bidi/>
-        <w:spacing w:before="120"/>
-        <w:jc w:val="left"/>
-        <w:rPr>
-          <w:rFonts w:ascii="Arial" w:eastAsia="Arial" w:hAnsi="Arial" w:cs="Arial"/>
-          <w:sz w:val="26"/>
-          <w:szCs w:val="26"/>
-        </w:rPr>
-      </w:pPr>
-      <w:r>
-        <w:rPr>
-          <w:rFonts w:ascii="Arial" w:eastAsia="Arial" w:hAnsi="Arial" w:cs="Arial"/>
-          <w:sz w:val="26"/>
-          <w:szCs w:val="26"/>
-          <w:rtl/>
-        </w:rPr>
-        <w:t xml:space="preserve">            أن أبوبكر أحمد المعلوم </w:t>
-      </w:r>
-      <w:r>
-        <w:rPr>
-          <w:rFonts w:ascii="Arial" w:eastAsia="Arial" w:hAnsi="Arial" w:cs="Arial"/>
-          <w:sz w:val="26"/>
-          <w:szCs w:val="26"/>
-        </w:rPr>
-        <w:t xml:space="preserve">   </w:t>
-      </w:r>
-      <w:fldSimple w:instr=" MERGEFIELD =employee_name_fr \* MERGEFORMAT ">
-        <w:r>
-          <w:rPr>
-            <w:rFonts w:ascii="Arial" w:eastAsia="Arial" w:hAnsi="Arial" w:cs="Arial"/>
-            <w:sz w:val="26"/>
-            <w:szCs w:val="26"/>
-          </w:rPr>
-          <w:t xml:space="preserve">«=employee_name_fr»</w:t>
-        </w:r>
-      </w:fldSimple>
-      <w:r>
-        <w:rPr>
-          <w:rFonts w:ascii="Arial" w:eastAsia="Arial" w:hAnsi="Arial" w:cs="Arial"/>
-          <w:sz w:val="26"/>
-          <w:szCs w:val="26"/>
-        </w:rPr>
-        <w:t xml:space="preserve"> </w:t>
-      </w:r>
-      <w:r>
-        <w:rPr>
-          <w:rFonts w:ascii="Arial" w:eastAsia="Arial" w:hAnsi="Arial" w:cs="Arial"/>
-          <w:sz w:val="26"/>
-          <w:szCs w:val="26"/>
-        </w:rPr>
-        <w:t xml:space="preserve">      </w:t>
-      </w:r>
-      <w:r>
-        <w:rPr>
-          <w:rFonts w:ascii="Arial" w:eastAsia="Arial" w:hAnsi="Arial" w:cs="Arial"/>
-          <w:sz w:val="26"/>
-          <w:szCs w:val="26"/>
-        </w:rPr>
-        <w:t xml:space="preserve">                                                                       </w:t>
-      </w:r>
-      <w:r>
-        <w:rPr>
-          <w:rFonts w:ascii="Arial" w:eastAsia="Arial" w:hAnsi="Arial" w:cs="Arial"/>
-          <w:sz w:val="26"/>
-          <w:szCs w:val="26"/>
-          <w:rtl/>
-        </w:rPr>
-        <w:t xml:space="preserve">                                                                                                                                                                                          </w:t>
-      </w:r>
-    </w:p>
+    <w:tbl>
+      <w:tblPr>
+        <w:tblW w:w="5000" w:type="pct"/>
+        <w:bidiVisual/>
+        <w:tblBorders>
+          <w:top w:val="nil"/>
+          <w:left w:val="nil"/>
+          <w:bottom w:val="nil"/>
+          <w:right w:val="nil"/>
+          <w:insideH w:val="nil"/>
+          <w:insideV w:val="nil"/>
+        </w:tblBorders>
+        <w:tblLayout w:type="fixed"/>
+      </w:tblPr>
+      <w:tblGrid>
+        <w:gridCol w:w="4700"/>
+        <w:gridCol w:w="4700"/>
+      </w:tblGrid>
+      <w:tr>
+        <w:tc>
+          <w:tcPr>
+            <w:tcW w:w="2500" w:type="pct"/>
+            <w:tcBorders>
+              <w:top w:val="nil"/>
+              <w:left w:val="nil"/>
+              <w:bottom w:val="nil"/>
+              <w:right w:val="nil"/>
+            </w:tcBorders>
+          </w:tcPr>
+          <w:p>
+            <w:pPr>
+              <w:bidi/>
+              <w:spacing w:before="120"/>
+              <w:jc w:val="center"/>
+              <w:rPr>
+                <w:rFonts w:ascii="Arial" w:eastAsia="Arial" w:hAnsi="Arial" w:cs="Arial"/>
+                <w:sz w:val="26"/>
+                <w:szCs w:val="26"/>
+                <w:rtl/>
+              </w:rPr>
+            </w:pPr>
+            <w:r>
+              <w:rPr>
+                <w:rFonts w:ascii="Arial" w:eastAsia="Arial" w:hAnsi="Arial" w:cs="Arial"/>
+                <w:sz w:val="26"/>
+                <w:szCs w:val="26"/>
+                <w:rtl/>
+              </w:rPr>
+              <w:t xml:space="preserve">الطرف الأول (منسق برنامج التعليم الأصلي)</w:t>
+            </w:r>
+          </w:p>
+          <w:p>
+            <w:pPr>
+              <w:bidi/>
+              <w:jc w:val="center"/>
+              <w:rPr>
+                <w:rFonts w:ascii="Arial" w:eastAsia="Arial" w:hAnsi="Arial" w:cs="Arial"/>
+                <w:sz w:val="26"/>
+                <w:szCs w:val="26"/>
+                <w:rtl/>
+              </w:rPr>
+            </w:pPr>
+            <w:r>
+              <w:drawing>
+                <wp:inline xmlns:a="http://schemas.openxmlformats.org/drawingml/2006/main" xmlns:pic="http://schemas.openxmlformats.org/drawingml/2006/picture">
+                  <wp:extent cx="1440000" cy="1028571"/>
+                  <wp:docPr id="1" name="Picture 1"/>
+                  <wp:cNvGraphicFramePr>
+                    <a:graphicFrameLocks noChangeAspect="1"/>
+                  </wp:cNvGraphicFramePr>
+                  <a:graphic>
+                    <a:graphicData uri="http://schemas.openxmlformats.org/drawingml/2006/picture">
+                      <pic:pic>
+                        <pic:nvPicPr>
+                          <pic:cNvPr id="0" name="director_signature.png"/>
+                          <pic:cNvPicPr/>
+                        </pic:nvPicPr>
+                        <pic:blipFill>
+                          <a:blip r:embed="rId6"/>
+                          <a:stretch>
+                            <a:fillRect/>
+                          </a:stretch>
+                        </pic:blipFill>
+                        <pic:spPr>
+                          <a:xfrm>
+                            <a:off x="0" y="0"/>
+                            <a:ext cx="1440000" cy="1028571"/>
+                          </a:xfrm>
+                          <a:prstGeom prst="rect"/>
+                        </pic:spPr>
+                      </pic:pic>
+                    </a:graphicData>
+                  </a:graphic>
+                </wp:inline>
+              </w:drawing>
+            </w:r>
+          </w:p>
+          <w:p>
+            <w:pPr>
+              <w:bidi/>
+              <w:jc w:val="center"/>
+              <w:rPr>
+                <w:rFonts w:ascii="Arial" w:eastAsia="Arial" w:hAnsi="Arial" w:cs="Arial"/>
+                <w:sz w:val="26"/>
+                <w:szCs w:val="26"/>
+                <w:rtl/>
+              </w:rPr>
+            </w:pPr>
+            <w:r>
+              <w:rPr>
+                <w:rFonts w:ascii="Arial" w:eastAsia="Arial" w:hAnsi="Arial" w:cs="Arial"/>
+                <w:sz w:val="26"/>
+                <w:szCs w:val="26"/>
+                <w:rtl/>
+                <w:b/>
+                <w:bCs/>
+              </w:rPr>
+              <w:t xml:space="preserve">أن أبوبكر أحمد المعلوم</w:t>
+            </w:r>
+          </w:p>
+        </w:tc>
+        <w:tc>
+          <w:tcPr>
+            <w:tcW w:w="2500" w:type="pct"/>
+            <w:tcBorders>
+              <w:top w:val="nil"/>
+              <w:left w:val="nil"/>
+              <w:bottom w:val="nil"/>
+              <w:right w:val="nil"/>
+            </w:tcBorders>
+          </w:tcPr>
+          <w:p>
+            <w:pPr>
+              <w:bidi/>
+              <w:spacing w:before="120"/>
+              <w:jc w:val="center"/>
+              <w:rPr>
+                <w:rFonts w:ascii="Arial" w:eastAsia="Arial" w:hAnsi="Arial" w:cs="Arial"/>
+                <w:sz w:val="26"/>
+                <w:szCs w:val="26"/>
+                <w:rtl/>
+              </w:rPr>
+            </w:pPr>
+            <w:r>
+              <w:rPr>
+                <w:rFonts w:ascii="Arial" w:eastAsia="Arial" w:hAnsi="Arial" w:cs="Arial"/>
+                <w:sz w:val="26"/>
+                <w:szCs w:val="26"/>
+                <w:rtl/>
+              </w:rPr>
+              <w:t xml:space="preserve">الطرف الثاني (شيخ المحظرة)</w:t>
+            </w:r>
+          </w:p>
+          <w:p>
+            <w:pPr>
+              <w:bidi/>
+              <w:jc w:val="center"/>
+              <w:rPr>
+                <w:rFonts w:ascii="Arial" w:eastAsia="Arial" w:hAnsi="Arial" w:cs="Arial"/>
+                <w:sz w:val="26"/>
+                <w:szCs w:val="26"/>
+                <w:rtl/>
+                <w:b/>
+                <w:bCs/>
+              </w:rPr>
+            </w:pPr>
+            <w:fldSimple w:instr=" MERGEFIELD =employee_name_fr \* MERGEFORMAT ">
+              <w:r>
+                <w:rPr>
+                  <w:rFonts w:ascii="Arial" w:eastAsia="Arial" w:hAnsi="Arial" w:cs="Arial"/>
+                  <w:sz w:val="26"/>
+                  <w:szCs w:val="26"/>
+                  <w:rtl/>
+                </w:rPr>
+                <w:t xml:space="preserve">«=employee_name_fr»</w:t>
+              </w:r>
+            </w:fldSimple>
+          </w:p>
+        </w:tc>
+      </w:tr>
+    </w:tbl>
     <w:sectPr>
       <w:pgSz w:w="11906" w:h="16838"/>
       <w:pgMar w:top="720" w:right="720" w:bottom="720" w:left="720" w:header="708" w:footer="708" w:gutter="0"/>

</xml_diff>

<commit_message>
Standardize CDD contract margins and line spacing
Page margins were 1.27cm (Word's "narrow" preset) on all sides, and
most paragraphs had no spacing between them at all, making the text
look cramped and non-standard. Set margins to 2cm left/right (1.5cm
top/bottom) and gave every paragraph consistent line height and
after-spacing, while shrinking the signature slightly so everything
still fits on a single page.
</commit_message>
<xml_diff>
--- a/backend/lib/templates/contract_cdd.docx
+++ b/backend/lib/templates/contract_cdd.docx
@@ -12,6 +12,7 @@
           <w:sz w:val="26"/>
           <w:szCs w:val="26"/>
         </w:rPr>
+        <w:spacing w:after="60" w:line="240" w:lineRule="auto"/>
       </w:pPr>
       <w:r>
         <w:rPr>
@@ -39,7 +40,7 @@
         <w:widowControl/>
         <w:shd w:val="clear" w:color="auto" w:fill="FFFFFF"/>
         <w:bidi/>
-        <w:spacing w:before="120"/>
+        <w:spacing w:after="60" w:line="240" w:lineRule="auto"/>
         <w:jc w:val="left"/>
         <w:rPr>
           <w:rFonts w:ascii="Arial" w:eastAsia="Arial" w:hAnsi="Arial" w:cs="Arial"/>
@@ -66,7 +67,7 @@
         <w:widowControl/>
         <w:shd w:val="clear" w:color="auto" w:fill="FFFFFF"/>
         <w:bidi/>
-        <w:spacing w:before="120"/>
+        <w:spacing w:after="60" w:line="240" w:lineRule="auto"/>
         <w:jc w:val="left"/>
         <w:rPr>
           <w:rFonts w:ascii="Arial" w:eastAsia="Arial" w:hAnsi="Arial" w:cs="Arial"/>
@@ -89,7 +90,7 @@
         <w:widowControl/>
         <w:shd w:val="clear" w:color="auto" w:fill="FFFFFF"/>
         <w:bidi/>
-        <w:spacing w:before="120"/>
+        <w:spacing w:after="60" w:line="240" w:lineRule="auto"/>
         <w:jc w:val="left"/>
         <w:rPr>
           <w:rFonts w:ascii="Arial" w:eastAsia="Arial" w:hAnsi="Arial" w:cs="Arial"/>
@@ -103,7 +104,7 @@
         <w:widowControl/>
         <w:shd w:val="clear" w:color="auto" w:fill="FFFFFF"/>
         <w:bidi/>
-        <w:spacing w:before="120"/>
+        <w:spacing w:after="60" w:line="240" w:lineRule="auto"/>
         <w:jc w:val="center"/>
         <w:rPr>
           <w:rFonts w:ascii="Arial" w:eastAsia="Arial" w:hAnsi="Arial" w:cs="Arial"/>
@@ -205,7 +206,7 @@
         <w:widowControl/>
         <w:shd w:val="clear" w:color="auto" w:fill="FFFFFF"/>
         <w:bidi/>
-        <w:spacing w:before="120"/>
+        <w:spacing w:after="60" w:line="240" w:lineRule="auto"/>
         <w:rPr>
           <w:rFonts w:ascii="Arial" w:eastAsia="Arial" w:hAnsi="Arial" w:cs="Arial"/>
           <w:b/>
@@ -272,7 +273,7 @@
         <w:widowControl/>
         <w:shd w:val="clear" w:color="auto" w:fill="FFFFFF"/>
         <w:bidi/>
-        <w:spacing w:before="120"/>
+        <w:spacing w:after="60" w:line="240" w:lineRule="auto"/>
         <w:rPr>
           <w:rFonts w:ascii="Arial" w:eastAsia="Arial" w:hAnsi="Arial" w:cs="Arial"/>
           <w:b/>
@@ -360,7 +361,7 @@
         <w:widowControl/>
         <w:shd w:val="clear" w:color="auto" w:fill="FFFFFF"/>
         <w:bidi/>
-        <w:spacing w:before="120"/>
+        <w:spacing w:after="60" w:line="240" w:lineRule="auto"/>
         <w:rPr>
           <w:rFonts w:ascii="Arial" w:eastAsia="Arial" w:hAnsi="Arial" w:cs="Arial"/>
           <w:b/>
@@ -445,7 +446,7 @@
         <w:widowControl/>
         <w:shd w:val="clear" w:color="auto" w:fill="FFFFFF"/>
         <w:bidi/>
-        <w:spacing w:before="120"/>
+        <w:spacing w:after="60" w:line="240" w:lineRule="auto"/>
         <w:rPr>
           <w:rFonts w:ascii="Arial" w:eastAsia="Arial" w:hAnsi="Arial" w:cs="Arial"/>
           <w:b/>
@@ -484,7 +485,7 @@
         <w:widowControl/>
         <w:shd w:val="clear" w:color="auto" w:fill="FFFFFF"/>
         <w:bidi/>
-        <w:spacing w:before="120"/>
+        <w:spacing w:after="60" w:line="240" w:lineRule="auto"/>
         <w:rPr>
           <w:rFonts w:ascii="Arial" w:eastAsia="Arial" w:hAnsi="Arial" w:cs="Arial"/>
           <w:b/>
@@ -534,7 +535,7 @@
         <w:widowControl/>
         <w:shd w:val="clear" w:color="auto" w:fill="FFFFFF"/>
         <w:bidi/>
-        <w:spacing w:before="120"/>
+        <w:spacing w:after="60" w:line="240" w:lineRule="auto"/>
         <w:rPr>
           <w:rFonts w:ascii="Arial" w:eastAsia="Arial" w:hAnsi="Arial" w:cs="Arial"/>
           <w:sz w:val="24"/>
@@ -558,7 +559,7 @@
         <w:widowControl/>
         <w:shd w:val="clear" w:color="auto" w:fill="FFFFFF"/>
         <w:bidi/>
-        <w:spacing w:before="120"/>
+        <w:spacing w:after="60" w:line="240" w:lineRule="auto"/>
         <w:rPr>
           <w:rFonts w:ascii="Arial" w:eastAsia="Arial" w:hAnsi="Arial" w:cs="Arial"/>
           <w:b/>
@@ -586,7 +587,7 @@
         <w:widowControl/>
         <w:shd w:val="clear" w:color="auto" w:fill="FFFFFF"/>
         <w:bidi/>
-        <w:spacing w:before="120"/>
+        <w:spacing w:after="60" w:line="240" w:lineRule="auto"/>
         <w:rPr>
           <w:rFonts w:ascii="Arial" w:eastAsia="Arial" w:hAnsi="Arial" w:cs="Arial"/>
           <w:sz w:val="24"/>
@@ -626,7 +627,7 @@
         <w:widowControl/>
         <w:shd w:val="clear" w:color="auto" w:fill="FFFFFF"/>
         <w:bidi/>
-        <w:spacing w:before="120"/>
+        <w:spacing w:after="60" w:line="240" w:lineRule="auto"/>
         <w:rPr>
           <w:rFonts w:ascii="Arial" w:eastAsia="Arial" w:hAnsi="Arial" w:cs="Arial"/>
           <w:sz w:val="24"/>
@@ -727,7 +728,7 @@
         <w:widowControl/>
         <w:shd w:val="clear" w:color="auto" w:fill="FFFFFF"/>
         <w:bidi/>
-        <w:spacing w:before="120"/>
+        <w:spacing w:after="60" w:line="240" w:lineRule="auto"/>
         <w:rPr>
           <w:rFonts w:ascii="Arial" w:eastAsia="Arial" w:hAnsi="Arial" w:cs="Arial"/>
           <w:sz w:val="24"/>
@@ -766,6 +767,7 @@
           <w:sz w:val="24"/>
           <w:szCs w:val="24"/>
         </w:rPr>
+        <w:spacing w:after="60" w:line="240" w:lineRule="auto"/>
       </w:pPr>
       <w:r>
         <w:rPr>
@@ -817,6 +819,7 @@
           <w:szCs w:val="24"/>
           <w:rtl/>
         </w:rPr>
+        <w:spacing w:after="60" w:line="240" w:lineRule="auto"/>
       </w:pPr>
       <w:r>
         <w:rPr>
@@ -976,6 +979,7 @@
           <w:sz w:val="24"/>
           <w:szCs w:val="24"/>
         </w:rPr>
+        <w:spacing w:after="60" w:line="240" w:lineRule="auto"/>
       </w:pPr>
       <w:r>
         <w:rPr>
@@ -1125,6 +1129,7 @@
           <w:sz w:val="24"/>
           <w:szCs w:val="24"/>
         </w:rPr>
+        <w:spacing w:after="60" w:line="240" w:lineRule="auto"/>
       </w:pPr>
       <w:r>
         <w:rPr>
@@ -1193,6 +1198,7 @@
           <w:sz w:val="24"/>
           <w:szCs w:val="24"/>
         </w:rPr>
+        <w:spacing w:after="60" w:line="240" w:lineRule="auto"/>
       </w:pPr>
       <w:r>
         <w:rPr>
@@ -1261,6 +1267,7 @@
           <w:sz w:val="24"/>
           <w:szCs w:val="24"/>
         </w:rPr>
+        <w:spacing w:after="60" w:line="240" w:lineRule="auto"/>
       </w:pPr>
       <w:r>
         <w:rPr>
@@ -1294,6 +1301,7 @@
           <w:sz w:val="24"/>
           <w:szCs w:val="24"/>
         </w:rPr>
+        <w:spacing w:after="60" w:line="240" w:lineRule="auto"/>
       </w:pPr>
       <w:bookmarkStart w:id="0" w:name="_rbchwi65eu6o" w:colFirst="0" w:colLast="0"/>
       <w:bookmarkEnd w:id="0"/>
@@ -1364,6 +1372,7 @@
           <w:sz w:val="24"/>
           <w:szCs w:val="24"/>
         </w:rPr>
+        <w:spacing w:after="60" w:line="240" w:lineRule="auto"/>
       </w:pPr>
       <w:r>
         <w:rPr>
@@ -1397,6 +1406,7 @@
           <w:sz w:val="24"/>
           <w:szCs w:val="24"/>
         </w:rPr>
+        <w:spacing w:after="60" w:line="240" w:lineRule="auto"/>
       </w:pPr>
       <w:r>
         <w:rPr>
@@ -1431,6 +1441,7 @@
           <w:sz w:val="26"/>
           <w:szCs w:val="26"/>
         </w:rPr>
+        <w:spacing w:after="60" w:line="240" w:lineRule="auto"/>
       </w:pPr>
     </w:p>
     <w:p>
@@ -1446,6 +1457,7 @@
           <w:sz w:val="26"/>
           <w:szCs w:val="26"/>
         </w:rPr>
+        <w:spacing w:after="60" w:line="240" w:lineRule="auto"/>
       </w:pPr>
       <w:r>
         <w:rPr>
@@ -1511,7 +1523,7 @@
           <w:p>
             <w:pPr>
               <w:bidi/>
-              <w:spacing w:before="120"/>
+              <w:spacing w:after="60" w:line="240" w:lineRule="auto"/>
               <w:jc w:val="center"/>
               <w:rPr>
                 <w:rFonts w:ascii="Arial" w:eastAsia="Arial" w:hAnsi="Arial" w:cs="Arial"/>
@@ -1540,11 +1552,12 @@
                 <w:szCs w:val="26"/>
                 <w:rtl/>
               </w:rPr>
+              <w:spacing w:after="60" w:line="240" w:lineRule="auto"/>
             </w:pPr>
             <w:r>
               <w:drawing>
                 <wp:inline xmlns:a="http://schemas.openxmlformats.org/drawingml/2006/main" xmlns:pic="http://schemas.openxmlformats.org/drawingml/2006/picture">
-                  <wp:extent cx="1440000" cy="1028571"/>
+                  <wp:extent cx="1007999" cy="719998"/>
                   <wp:docPr id="1" name="Picture 1"/>
                   <wp:cNvGraphicFramePr>
                     <a:graphicFrameLocks noChangeAspect="1"/>
@@ -1565,7 +1578,7 @@
                         <pic:spPr>
                           <a:xfrm>
                             <a:off x="0" y="0"/>
-                            <a:ext cx="1440000" cy="1028571"/>
+                            <a:ext cx="1007999" cy="719998"/>
                           </a:xfrm>
                           <a:prstGeom prst="rect"/>
                         </pic:spPr>
@@ -1586,6 +1599,7 @@
                 <w:szCs w:val="26"/>
                 <w:rtl/>
               </w:rPr>
+              <w:spacing w:after="60" w:line="240" w:lineRule="auto"/>
             </w:pPr>
             <w:r>
               <w:rPr>
@@ -1613,7 +1627,7 @@
           <w:p>
             <w:pPr>
               <w:bidi/>
-              <w:spacing w:before="120"/>
+              <w:spacing w:after="60" w:line="240" w:lineRule="auto"/>
               <w:jc w:val="center"/>
               <w:rPr>
                 <w:rFonts w:ascii="Arial" w:eastAsia="Arial" w:hAnsi="Arial" w:cs="Arial"/>
@@ -1644,6 +1658,7 @@
                 <w:b/>
                 <w:bCs/>
               </w:rPr>
+              <w:spacing w:after="60" w:line="240" w:lineRule="auto"/>
             </w:pPr>
             <w:fldSimple w:instr=" MERGEFIELD =employee_name_fr \* MERGEFORMAT ">
               <w:r>
@@ -1662,7 +1677,7 @@
     </w:tbl>
     <w:sectPr>
       <w:pgSz w:w="11906" w:h="16838"/>
-      <w:pgMar w:top="720" w:right="720" w:bottom="720" w:left="720" w:header="708" w:footer="708" w:gutter="0"/>
+      <w:pgMar w:top="850" w:right="1134" w:bottom="850" w:left="1134" w:header="708" w:footer="708" w:gutter="0"/>
       <w:pgNumType w:start="1"/>
       <w:cols w:space="720"/>
     </w:sectPr>

</xml_diff>

<commit_message>
Rebuild CDD template from the updated source with author's line spacing
The source cdd_lastversion.docx was edited directly in Word (1.15x line
spacing added to the article paragraphs). Rebuilds the merge-field
template from this new source — same field wiring, signature table and
signature image as before — and preserves the author's line-spacing
choice instead of overriding it. Trims the header block's paragraph
spacing (6pt -> 3pt before each identity line) to compensate for the
extra height so everything still fits on one page.
</commit_message>
<xml_diff>
--- a/backend/lib/templates/contract_cdd.docx
+++ b/backend/lib/templates/contract_cdd.docx
@@ -1,6 +1,6 @@
 
 <file path=word/document.xml><?xml version="1.0" encoding="utf-8"?>
-<w:document xmlns:wpc="http://schemas.microsoft.com/office/word/2010/wordprocessingCanvas" xmlns:cx="http://schemas.microsoft.com/office/drawing/2014/chartex" xmlns:cx1="http://schemas.microsoft.com/office/drawing/2015/9/8/chartex" xmlns:cx2="http://schemas.microsoft.com/office/drawing/2015/10/21/chartex" xmlns:cx3="http://schemas.microsoft.com/office/drawing/2016/5/9/chartex" xmlns:cx4="http://schemas.microsoft.com/office/drawing/2016/5/10/chartex" xmlns:cx5="http://schemas.microsoft.com/office/drawing/2016/5/11/chartex" xmlns:cx6="http://schemas.microsoft.com/office/drawing/2016/5/12/chartex" xmlns:cx7="http://schemas.microsoft.com/office/drawing/2016/5/13/chartex" xmlns:cx8="http://schemas.microsoft.com/office/drawing/2016/5/14/chartex" xmlns:mc="http://schemas.openxmlformats.org/markup-compatibility/2006" xmlns:aink="http://schemas.microsoft.com/office/drawing/2016/ink" xmlns:am3d="http://schemas.microsoft.com/office/drawing/2017/model3d" xmlns:o="urn:schemas-microsoft-com:office:office" xmlns:oel="http://schemas.microsoft.com/office/2019/extlst" xmlns:r="http://schemas.openxmlformats.org/officeDocument/2006/relationships" xmlns:m="http://schemas.openxmlformats.org/officeDocument/2006/math" xmlns:v="urn:schemas-microsoft-com:vml" xmlns:wp14="http://schemas.microsoft.com/office/word/2010/wordprocessingDrawing" xmlns:wp="http://schemas.openxmlformats.org/drawingml/2006/wordprocessingDrawing" xmlns:w10="urn:schemas-microsoft-com:office:word" xmlns:w="http://schemas.openxmlformats.org/wordprocessingml/2006/main" xmlns:w14="http://schemas.microsoft.com/office/word/2010/wordml" xmlns:w15="http://schemas.microsoft.com/office/word/2012/wordml" xmlns:w16cei="http://schemas.microsoft.com/office/word/2026/wordml/cei" xmlns:w16cex="http://schemas.microsoft.com/office/word/2018/wordml/cex" xmlns:w16cid="http://schemas.microsoft.com/office/word/2016/wordml/cid" xmlns:w16="http://schemas.microsoft.com/office/word/2018/wordml" xmlns:w16du="http://schemas.microsoft.com/office/word/2023/wordml/word16du" xmlns:w16sdtdh="http://schemas.microsoft.com/office/word/2020/wordml/sdtdatahash" xmlns:w16sdtfl="http://schemas.microsoft.com/office/word/2024/wordml/sdtformatlock" xmlns:w16se="http://schemas.microsoft.com/office/word/2015/wordml/symex" xmlns:wpg="http://schemas.microsoft.com/office/word/2010/wordprocessingGroup" xmlns:wpi="http://schemas.microsoft.com/office/word/2010/wordprocessingInk" xmlns:wne="http://schemas.microsoft.com/office/word/2006/wordml" xmlns:wps="http://schemas.microsoft.com/office/word/2010/wordprocessingShape" mc:Ignorable="w14 w15 w16se w16cid w16 w16cex w16sdtdh w16sdtfl w16du wp14">
+<w:document xmlns:wpc="http://schemas.microsoft.com/office/word/2010/wordprocessingCanvas" xmlns:cx="http://schemas.microsoft.com/office/drawing/2014/chartex" xmlns:cx1="http://schemas.microsoft.com/office/drawing/2015/9/8/chartex" xmlns:cx2="http://schemas.microsoft.com/office/drawing/2015/10/21/chartex" xmlns:cx3="http://schemas.microsoft.com/office/drawing/2016/5/9/chartex" xmlns:cx4="http://schemas.microsoft.com/office/drawing/2016/5/10/chartex" xmlns:cx5="http://schemas.microsoft.com/office/drawing/2016/5/11/chartex" xmlns:cx6="http://schemas.microsoft.com/office/drawing/2016/5/12/chartex" xmlns:cx7="http://schemas.microsoft.com/office/drawing/2016/5/13/chartex" xmlns:cx8="http://schemas.microsoft.com/office/drawing/2016/5/14/chartex" xmlns:mc="http://schemas.openxmlformats.org/markup-compatibility/2006" xmlns:m="http://schemas.openxmlformats.org/officeDocument/2006/math" xmlns:aink="http://schemas.microsoft.com/office/drawing/2016/ink" xmlns:am3d="http://schemas.microsoft.com/office/drawing/2017/model3d" xmlns:oel="http://schemas.microsoft.com/office/2019/extlst" xmlns:r="http://schemas.openxmlformats.org/officeDocument/2006/relationships" xmlns:wp14="http://schemas.microsoft.com/office/word/2010/wordprocessingDrawing" xmlns:wp="http://schemas.openxmlformats.org/drawingml/2006/wordprocessingDrawing" xmlns:wpg="http://schemas.microsoft.com/office/word/2010/wordprocessingGroup" xmlns:wpi="http://schemas.microsoft.com/office/word/2010/wordprocessingInk" xmlns:wps="http://schemas.microsoft.com/office/word/2010/wordprocessingShape" xmlns:o="urn:schemas-microsoft-com:office:office" xmlns:v="urn:schemas-microsoft-com:vml" xmlns:w10="urn:schemas-microsoft-com:office:word" xmlns:w="http://schemas.openxmlformats.org/wordprocessingml/2006/main" xmlns:w14="http://schemas.microsoft.com/office/word/2010/wordml" xmlns:w15="http://schemas.microsoft.com/office/word/2012/wordml" xmlns:w16cex="http://schemas.microsoft.com/office/word/2018/wordml/cex" xmlns:w16cid="http://schemas.microsoft.com/office/word/2016/wordml/cid" xmlns:w16="http://schemas.microsoft.com/office/word/2018/wordml" xmlns:w16sdtdh="http://schemas.microsoft.com/office/word/2020/wordml/sdtdatahash" xmlns:w16sdtfl="http://schemas.microsoft.com/office/word/2024/wordml/sdtformatlock" xmlns:w16se="http://schemas.microsoft.com/office/word/2015/wordml/symex" xmlns:w16du="http://schemas.microsoft.com/office/word/2023/wordml/word16du" xmlns:wne="http://schemas.microsoft.com/office/word/2006/wordml" mc:Ignorable="w14 w15 w16se w16cid w16 w16cex w16sdtdh w16sdtfl w16du wp14">
   <w:body>
     <w:p>
       <w:pPr>
@@ -12,7 +12,6 @@
           <w:sz w:val="26"/>
           <w:szCs w:val="26"/>
         </w:rPr>
-        <w:spacing w:after="60" w:line="240" w:lineRule="auto"/>
       </w:pPr>
       <w:r>
         <w:rPr>
@@ -40,7 +39,7 @@
         <w:widowControl/>
         <w:shd w:val="clear" w:color="auto" w:fill="FFFFFF"/>
         <w:bidi/>
-        <w:spacing w:after="60" w:line="240" w:lineRule="auto"/>
+        <w:spacing w:before="60"/>
         <w:jc w:val="left"/>
         <w:rPr>
           <w:rFonts w:ascii="Arial" w:eastAsia="Arial" w:hAnsi="Arial" w:cs="Arial"/>
@@ -67,7 +66,7 @@
         <w:widowControl/>
         <w:shd w:val="clear" w:color="auto" w:fill="FFFFFF"/>
         <w:bidi/>
-        <w:spacing w:after="60" w:line="240" w:lineRule="auto"/>
+        <w:spacing w:before="60"/>
         <w:jc w:val="left"/>
         <w:rPr>
           <w:rFonts w:ascii="Arial" w:eastAsia="Arial" w:hAnsi="Arial" w:cs="Arial"/>
@@ -90,7 +89,7 @@
         <w:widowControl/>
         <w:shd w:val="clear" w:color="auto" w:fill="FFFFFF"/>
         <w:bidi/>
-        <w:spacing w:after="60" w:line="240" w:lineRule="auto"/>
+        <w:spacing w:before="60"/>
         <w:jc w:val="left"/>
         <w:rPr>
           <w:rFonts w:ascii="Arial" w:eastAsia="Arial" w:hAnsi="Arial" w:cs="Arial"/>
@@ -104,7 +103,7 @@
         <w:widowControl/>
         <w:shd w:val="clear" w:color="auto" w:fill="FFFFFF"/>
         <w:bidi/>
-        <w:spacing w:after="60" w:line="240" w:lineRule="auto"/>
+        <w:spacing w:before="60"/>
         <w:jc w:val="center"/>
         <w:rPr>
           <w:rFonts w:ascii="Arial" w:eastAsia="Arial" w:hAnsi="Arial" w:cs="Arial"/>
@@ -206,7 +205,7 @@
         <w:widowControl/>
         <w:shd w:val="clear" w:color="auto" w:fill="FFFFFF"/>
         <w:bidi/>
-        <w:spacing w:after="60" w:line="240" w:lineRule="auto"/>
+        <w:spacing w:before="60"/>
         <w:rPr>
           <w:rFonts w:ascii="Arial" w:eastAsia="Arial" w:hAnsi="Arial" w:cs="Arial"/>
           <w:b/>
@@ -226,16 +225,26 @@
           <w:u w:val="single"/>
           <w:rtl/>
         </w:rPr>
-        <w:t>الطرف الأول:</w:t>
-      </w:r>
-      <w:r>
-        <w:rPr>
-          <w:rFonts w:ascii="Arial" w:eastAsia="Arial" w:hAnsi="Arial" w:cs="Arial"/>
-          <w:b/>
-          <w:bCs/>
-          <w:sz w:val="24"/>
-          <w:szCs w:val="24"/>
-          <w:u w:val="single"/>
+        <w:t>الطرف الأول</w:t>
+      </w:r>
+      <w:r>
+        <w:rPr>
+          <w:rFonts w:ascii="Arial" w:eastAsia="Arial" w:hAnsi="Arial" w:cs="Arial"/>
+          <w:b/>
+          <w:bCs/>
+          <w:sz w:val="24"/>
+          <w:szCs w:val="24"/>
+          <w:rtl/>
+        </w:rPr>
+        <w:t>:</w:t>
+      </w:r>
+      <w:r>
+        <w:rPr>
+          <w:rFonts w:ascii="Arial" w:eastAsia="Arial" w:hAnsi="Arial" w:cs="Arial"/>
+          <w:b/>
+          <w:bCs/>
+          <w:sz w:val="24"/>
+          <w:szCs w:val="24"/>
         </w:rPr>
         <w:t xml:space="preserve"> </w:t>
       </w:r>
@@ -273,22 +282,23 @@
         <w:widowControl/>
         <w:shd w:val="clear" w:color="auto" w:fill="FFFFFF"/>
         <w:bidi/>
-        <w:spacing w:after="60" w:line="240" w:lineRule="auto"/>
-        <w:rPr>
-          <w:rFonts w:ascii="Arial" w:eastAsia="Arial" w:hAnsi="Arial" w:cs="Arial"/>
-          <w:b/>
-          <w:bCs/>
-          <w:sz w:val="24"/>
-          <w:szCs w:val="24"/>
-        </w:rPr>
-      </w:pPr>
-      <w:r>
-        <w:rPr>
-          <w:rFonts w:ascii="Arial" w:eastAsia="Arial" w:hAnsi="Arial" w:cs="Arial"/>
-          <w:b/>
-          <w:bCs/>
-          <w:sz w:val="24"/>
-          <w:szCs w:val="24"/>
+        <w:spacing w:before="60"/>
+        <w:rPr>
+          <w:rFonts w:ascii="Arial" w:eastAsia="Arial" w:hAnsi="Arial" w:cs="Arial"/>
+          <w:b/>
+          <w:bCs/>
+          <w:sz w:val="24"/>
+          <w:szCs w:val="24"/>
+        </w:rPr>
+      </w:pPr>
+      <w:r>
+        <w:rPr>
+          <w:rFonts w:ascii="Arial" w:eastAsia="Arial" w:hAnsi="Arial" w:cs="Arial"/>
+          <w:b/>
+          <w:bCs/>
+          <w:sz w:val="24"/>
+          <w:szCs w:val="24"/>
+          <w:u w:val="single"/>
           <w:rtl/>
         </w:rPr>
         <w:t>الطرف الثاني</w:t>
@@ -361,7 +371,7 @@
         <w:widowControl/>
         <w:shd w:val="clear" w:color="auto" w:fill="FFFFFF"/>
         <w:bidi/>
-        <w:spacing w:after="60" w:line="240" w:lineRule="auto"/>
+        <w:spacing w:before="60"/>
         <w:rPr>
           <w:rFonts w:ascii="Arial" w:eastAsia="Arial" w:hAnsi="Arial" w:cs="Arial"/>
           <w:b/>
@@ -446,7 +456,7 @@
         <w:widowControl/>
         <w:shd w:val="clear" w:color="auto" w:fill="FFFFFF"/>
         <w:bidi/>
-        <w:spacing w:after="60" w:line="240" w:lineRule="auto"/>
+        <w:spacing w:before="60"/>
         <w:rPr>
           <w:rFonts w:ascii="Arial" w:eastAsia="Arial" w:hAnsi="Arial" w:cs="Arial"/>
           <w:b/>
@@ -485,7 +495,7 @@
         <w:widowControl/>
         <w:shd w:val="clear" w:color="auto" w:fill="FFFFFF"/>
         <w:bidi/>
-        <w:spacing w:after="60" w:line="240" w:lineRule="auto"/>
+        <w:spacing w:before="60"/>
         <w:rPr>
           <w:rFonts w:ascii="Arial" w:eastAsia="Arial" w:hAnsi="Arial" w:cs="Arial"/>
           <w:b/>
@@ -535,23 +545,25 @@
         <w:widowControl/>
         <w:shd w:val="clear" w:color="auto" w:fill="FFFFFF"/>
         <w:bidi/>
-        <w:spacing w:after="60" w:line="240" w:lineRule="auto"/>
-        <w:rPr>
-          <w:rFonts w:ascii="Arial" w:eastAsia="Arial" w:hAnsi="Arial" w:cs="Arial"/>
-          <w:sz w:val="24"/>
-          <w:szCs w:val="24"/>
-        </w:rPr>
-      </w:pPr>
-      <w:r>
-        <w:rPr>
-          <w:rFonts w:ascii="Arial" w:eastAsia="Arial" w:hAnsi="Arial" w:cs="Arial"/>
-          <w:b/>
-          <w:bCs/>
-          <w:sz w:val="24"/>
-          <w:szCs w:val="24"/>
-          <w:rtl/>
-        </w:rPr>
-        <w:t xml:space="preserve">   ويشار إليهما مجتمعين بـ “الطرفين”.</w:t>
+        <w:spacing w:before="60"/>
+        <w:rPr>
+          <w:rFonts w:ascii="Arial" w:eastAsia="Arial" w:hAnsi="Arial" w:cs="Arial"/>
+          <w:b/>
+          <w:bCs/>
+          <w:sz w:val="24"/>
+          <w:szCs w:val="24"/>
+        </w:rPr>
+      </w:pPr>
+      <w:r>
+        <w:rPr>
+          <w:rFonts w:ascii="Arial" w:eastAsia="Arial" w:hAnsi="Arial" w:cs="Arial"/>
+          <w:b/>
+          <w:bCs/>
+          <w:sz w:val="24"/>
+          <w:szCs w:val="24"/>
+          <w:rtl/>
+        </w:rPr>
+        <w:t xml:space="preserve">  </w:t>
       </w:r>
     </w:p>
     <w:p>
@@ -559,27 +571,23 @@
         <w:widowControl/>
         <w:shd w:val="clear" w:color="auto" w:fill="FFFFFF"/>
         <w:bidi/>
-        <w:spacing w:after="60" w:line="240" w:lineRule="auto"/>
-        <w:rPr>
-          <w:rFonts w:ascii="Arial" w:eastAsia="Arial" w:hAnsi="Arial" w:cs="Arial"/>
-          <w:b/>
-          <w:bCs/>
-          <w:sz w:val="24"/>
-          <w:szCs w:val="24"/>
-          <w:u w:val="single"/>
-        </w:rPr>
-      </w:pPr>
-      <w:r>
-        <w:rPr>
-          <w:rFonts w:ascii="Arial" w:eastAsia="Arial" w:hAnsi="Arial" w:cs="Arial"/>
-          <w:b/>
-          <w:bCs/>
-          <w:sz w:val="24"/>
-          <w:szCs w:val="24"/>
-          <w:u w:val="single"/>
-          <w:rtl/>
-        </w:rPr>
-        <w:t>الديباجة</w:t>
+        <w:spacing w:before="60"/>
+        <w:rPr>
+          <w:rFonts w:ascii="Arial" w:eastAsia="Arial" w:hAnsi="Arial" w:cs="Arial"/>
+          <w:sz w:val="24"/>
+          <w:szCs w:val="24"/>
+        </w:rPr>
+      </w:pPr>
+      <w:r>
+        <w:rPr>
+          <w:rFonts w:ascii="Arial" w:eastAsia="Arial" w:hAnsi="Arial" w:cs="Arial"/>
+          <w:b/>
+          <w:bCs/>
+          <w:sz w:val="24"/>
+          <w:szCs w:val="24"/>
+          <w:rtl/>
+        </w:rPr>
+        <w:t xml:space="preserve"> ويشار إليهما مجتمعين بـ “الطرفين”.</w:t>
       </w:r>
     </w:p>
     <w:p>
@@ -587,39 +595,27 @@
         <w:widowControl/>
         <w:shd w:val="clear" w:color="auto" w:fill="FFFFFF"/>
         <w:bidi/>
-        <w:spacing w:after="60" w:line="240" w:lineRule="auto"/>
-        <w:rPr>
-          <w:rFonts w:ascii="Arial" w:eastAsia="Arial" w:hAnsi="Arial" w:cs="Arial"/>
-          <w:sz w:val="24"/>
-          <w:szCs w:val="24"/>
-        </w:rPr>
-      </w:pPr>
-      <w:r>
-        <w:rPr>
-          <w:rFonts w:ascii="Arial" w:eastAsia="Arial" w:hAnsi="Arial" w:cs="Arial"/>
-          <w:sz w:val="24"/>
-          <w:szCs w:val="24"/>
-          <w:rtl/>
-        </w:rPr>
-        <w:t xml:space="preserve">في إطار تنفيذ برنامج دعم التعليم الأصلي بالمناطق الأقل حظا في التعليم وحرصا على ضمان التدريس في المحاظر المدعومة من قبل المشروع وبما يضمن تحقيق المردودية المنشودة، اتفق الطرفان على إبرام هذا العقد وفقا </w:t>
-      </w:r>
-      <w:r>
-        <w:rPr>
-          <w:rFonts w:ascii="Arial" w:eastAsia="Arial" w:hAnsi="Arial" w:cs="Arial"/>
-          <w:sz w:val="24"/>
-          <w:szCs w:val="24"/>
-          <w:rtl/>
-        </w:rPr>
-        <w:t xml:space="preserve">للأحكام </w:t>
-      </w:r>
-      <w:r>
-        <w:rPr>
-          <w:rFonts w:ascii="Arial" w:eastAsia="Arial" w:hAnsi="Arial" w:cs="Arial"/>
-          <w:sz w:val="24"/>
-          <w:szCs w:val="24"/>
-          <w:rtl/>
-        </w:rPr>
-        <w:t>التالية:</w:t>
+        <w:spacing w:before="60"/>
+        <w:rPr>
+          <w:rFonts w:ascii="Arial" w:eastAsia="Arial" w:hAnsi="Arial" w:cs="Arial"/>
+          <w:b/>
+          <w:bCs/>
+          <w:sz w:val="24"/>
+          <w:szCs w:val="24"/>
+          <w:u w:val="single"/>
+        </w:rPr>
+      </w:pPr>
+      <w:r>
+        <w:rPr>
+          <w:rFonts w:ascii="Arial" w:eastAsia="Arial" w:hAnsi="Arial" w:cs="Arial"/>
+          <w:b/>
+          <w:bCs/>
+          <w:sz w:val="24"/>
+          <w:szCs w:val="24"/>
+          <w:u w:val="single"/>
+          <w:rtl/>
+        </w:rPr>
+        <w:t>الديباجة</w:t>
       </w:r>
     </w:p>
     <w:p>
@@ -627,7 +623,47 @@
         <w:widowControl/>
         <w:shd w:val="clear" w:color="auto" w:fill="FFFFFF"/>
         <w:bidi/>
-        <w:spacing w:after="60" w:line="240" w:lineRule="auto"/>
+        <w:spacing w:before="60" w:line="276" w:lineRule="auto"/>
+        <w:rPr>
+          <w:rFonts w:ascii="Arial" w:eastAsia="Arial" w:hAnsi="Arial" w:cs="Arial"/>
+          <w:sz w:val="24"/>
+          <w:szCs w:val="24"/>
+        </w:rPr>
+      </w:pPr>
+      <w:r>
+        <w:rPr>
+          <w:rFonts w:ascii="Arial" w:eastAsia="Arial" w:hAnsi="Arial" w:cs="Arial"/>
+          <w:sz w:val="24"/>
+          <w:szCs w:val="24"/>
+          <w:rtl/>
+        </w:rPr>
+        <w:t xml:space="preserve">في إطار تنفيذ برنامج دعم التعليم الأصلي بالمناطق الأقل حظا في التعليم وحرصا على ضمان التدريس في المحاظر المدعومة من قبل المشروع وبما يضمن تحقيق المردودية المنشودة، اتفق الطرفان على إبرام هذا العقد وفقا </w:t>
+      </w:r>
+      <w:r>
+        <w:rPr>
+          <w:rFonts w:ascii="Arial" w:eastAsia="Arial" w:hAnsi="Arial" w:cs="Arial"/>
+          <w:sz w:val="24"/>
+          <w:szCs w:val="24"/>
+          <w:rtl/>
+        </w:rPr>
+        <w:t xml:space="preserve">للأحكام </w:t>
+      </w:r>
+      <w:r>
+        <w:rPr>
+          <w:rFonts w:ascii="Arial" w:eastAsia="Arial" w:hAnsi="Arial" w:cs="Arial"/>
+          <w:sz w:val="24"/>
+          <w:szCs w:val="24"/>
+          <w:rtl/>
+        </w:rPr>
+        <w:t>التالية:</w:t>
+      </w:r>
+    </w:p>
+    <w:p>
+      <w:pPr>
+        <w:widowControl/>
+        <w:shd w:val="clear" w:color="auto" w:fill="FFFFFF"/>
+        <w:bidi/>
+        <w:spacing w:before="60" w:line="276" w:lineRule="auto"/>
         <w:rPr>
           <w:rFonts w:ascii="Arial" w:eastAsia="Arial" w:hAnsi="Arial" w:cs="Arial"/>
           <w:sz w:val="24"/>
@@ -644,7 +680,18 @@
           <w:u w:val="single"/>
           <w:rtl/>
         </w:rPr>
-        <w:t xml:space="preserve">المادة الأولي: </w:t>
+        <w:t>المادة الأولي:</w:t>
+      </w:r>
+      <w:r>
+        <w:rPr>
+          <w:rFonts w:ascii="Arial" w:eastAsia="Arial" w:hAnsi="Arial" w:cs="Arial"/>
+          <w:b/>
+          <w:bCs/>
+          <w:sz w:val="24"/>
+          <w:szCs w:val="24"/>
+          <w:rtl/>
+        </w:rPr>
+        <w:t xml:space="preserve"> </w:t>
       </w:r>
       <w:r>
         <w:rPr>
@@ -728,7 +775,7 @@
         <w:widowControl/>
         <w:shd w:val="clear" w:color="auto" w:fill="FFFFFF"/>
         <w:bidi/>
-        <w:spacing w:after="60" w:line="240" w:lineRule="auto"/>
+        <w:spacing w:before="60" w:line="276" w:lineRule="auto"/>
         <w:rPr>
           <w:rFonts w:ascii="Arial" w:eastAsia="Arial" w:hAnsi="Arial" w:cs="Arial"/>
           <w:sz w:val="24"/>
@@ -762,12 +809,12 @@
         <w:widowControl/>
         <w:shd w:val="clear" w:color="auto" w:fill="FFFFFF"/>
         <w:bidi/>
-        <w:rPr>
-          <w:rFonts w:ascii="Arial" w:eastAsia="Arial" w:hAnsi="Arial" w:cs="Arial"/>
-          <w:sz w:val="24"/>
-          <w:szCs w:val="24"/>
-        </w:rPr>
-        <w:spacing w:after="60" w:line="240" w:lineRule="auto"/>
+        <w:spacing w:line="276" w:lineRule="auto"/>
+        <w:rPr>
+          <w:rFonts w:ascii="Arial" w:eastAsia="Arial" w:hAnsi="Arial" w:cs="Arial"/>
+          <w:sz w:val="24"/>
+          <w:szCs w:val="24"/>
+        </w:rPr>
       </w:pPr>
       <w:r>
         <w:rPr>
@@ -813,13 +860,13 @@
         <w:widowControl/>
         <w:shd w:val="clear" w:color="auto" w:fill="FFFFFF"/>
         <w:bidi/>
-        <w:rPr>
-          <w:rFonts w:ascii="Arial" w:eastAsia="Arial" w:hAnsi="Arial" w:cs="Arial" w:hint="cs"/>
-          <w:sz w:val="24"/>
-          <w:szCs w:val="24"/>
-          <w:rtl/>
-        </w:rPr>
-        <w:spacing w:after="60" w:line="240" w:lineRule="auto"/>
+        <w:spacing w:line="276" w:lineRule="auto"/>
+        <w:rPr>
+          <w:rFonts w:ascii="Arial" w:eastAsia="Arial" w:hAnsi="Arial" w:cs="Arial"/>
+          <w:sz w:val="24"/>
+          <w:szCs w:val="24"/>
+          <w:rtl/>
+        </w:rPr>
       </w:pPr>
       <w:r>
         <w:rPr>
@@ -905,6 +952,7 @@
         </w:rPr>
         <w:t xml:space="preserve"> </w:t>
       </w:r>
+      <w:proofErr w:type="gramStart"/>
       <w:r>
         <w:rPr>
           <w:rFonts w:ascii="Arial" w:eastAsia="Arial" w:hAnsi="Arial" w:cs="Arial"/>
@@ -931,6 +979,7 @@
         </w:rPr>
         <w:t>(</w:t>
       </w:r>
+      <w:proofErr w:type="gramEnd"/>
       <w:r>
         <w:rPr>
           <w:rFonts w:ascii="Arial" w:eastAsia="Arial" w:hAnsi="Arial" w:cs="Arial"/>
@@ -974,12 +1023,12 @@
         <w:widowControl/>
         <w:shd w:val="clear" w:color="auto" w:fill="FFFFFF"/>
         <w:bidi/>
-        <w:rPr>
-          <w:rFonts w:ascii="Arial" w:eastAsia="Arial" w:hAnsi="Arial" w:cs="Arial"/>
-          <w:sz w:val="24"/>
-          <w:szCs w:val="24"/>
-        </w:rPr>
-        <w:spacing w:after="60" w:line="240" w:lineRule="auto"/>
+        <w:spacing w:line="276" w:lineRule="auto"/>
+        <w:rPr>
+          <w:rFonts w:ascii="Arial" w:eastAsia="Arial" w:hAnsi="Arial" w:cs="Arial"/>
+          <w:sz w:val="24"/>
+          <w:szCs w:val="24"/>
+        </w:rPr>
       </w:pPr>
       <w:r>
         <w:rPr>
@@ -1040,47 +1089,7 @@
           <w:sz w:val="24"/>
           <w:szCs w:val="24"/>
         </w:rPr>
-        <w:t>31</w:t>
-      </w:r>
-      <w:r>
-        <w:rPr>
-          <w:rFonts w:ascii="Arial" w:eastAsia="Arial" w:hAnsi="Arial" w:cs="Arial"/>
-          <w:b/>
-          <w:bCs/>
-          <w:sz w:val="24"/>
-          <w:szCs w:val="24"/>
-        </w:rPr>
-        <w:t>/</w:t>
-      </w:r>
-      <w:r>
-        <w:rPr>
-          <w:rFonts w:ascii="Arial" w:eastAsia="Arial" w:hAnsi="Arial" w:cs="Arial"/>
-          <w:b/>
-          <w:bCs/>
-          <w:sz w:val="24"/>
-          <w:szCs w:val="24"/>
-        </w:rPr>
-        <w:t>12</w:t>
-      </w:r>
-      <w:r>
-        <w:rPr>
-          <w:rFonts w:ascii="Arial" w:eastAsia="Arial" w:hAnsi="Arial" w:cs="Arial"/>
-          <w:b/>
-          <w:bCs/>
-          <w:sz w:val="24"/>
-          <w:szCs w:val="24"/>
-        </w:rPr>
-        <w:t>/</w:t>
-      </w:r>
-      <w:r>
-        <w:rPr>
-          <w:rFonts w:ascii="Arial" w:eastAsia="Arial" w:hAnsi="Arial" w:cs="Arial"/>
-          <w:b/>
-          <w:bCs/>
-          <w:sz w:val="24"/>
-          <w:szCs w:val="24"/>
-        </w:rPr>
-        <w:t>2026</w:t>
+        <w:t>31/12/2026</w:t>
       </w:r>
       <w:r>
         <w:rPr>
@@ -1124,12 +1133,12 @@
         <w:widowControl/>
         <w:shd w:val="clear" w:color="auto" w:fill="FFFFFF"/>
         <w:bidi/>
-        <w:rPr>
-          <w:rFonts w:ascii="Arial" w:eastAsia="Arial" w:hAnsi="Arial" w:cs="Arial"/>
-          <w:sz w:val="24"/>
-          <w:szCs w:val="24"/>
-        </w:rPr>
-        <w:spacing w:after="60" w:line="240" w:lineRule="auto"/>
+        <w:spacing w:line="276" w:lineRule="auto"/>
+        <w:rPr>
+          <w:rFonts w:ascii="Arial" w:eastAsia="Arial" w:hAnsi="Arial" w:cs="Arial"/>
+          <w:sz w:val="24"/>
+          <w:szCs w:val="24"/>
+        </w:rPr>
       </w:pPr>
       <w:r>
         <w:rPr>
@@ -1193,12 +1202,12 @@
         <w:widowControl/>
         <w:shd w:val="clear" w:color="auto" w:fill="FFFFFF"/>
         <w:bidi/>
-        <w:rPr>
-          <w:rFonts w:ascii="Arial" w:eastAsia="Arial" w:hAnsi="Arial" w:cs="Arial"/>
-          <w:sz w:val="24"/>
-          <w:szCs w:val="24"/>
-        </w:rPr>
-        <w:spacing w:after="60" w:line="240" w:lineRule="auto"/>
+        <w:spacing w:line="276" w:lineRule="auto"/>
+        <w:rPr>
+          <w:rFonts w:ascii="Arial" w:eastAsia="Arial" w:hAnsi="Arial" w:cs="Arial"/>
+          <w:sz w:val="24"/>
+          <w:szCs w:val="24"/>
+        </w:rPr>
       </w:pPr>
       <w:r>
         <w:rPr>
@@ -1262,12 +1271,12 @@
         <w:widowControl/>
         <w:shd w:val="clear" w:color="auto" w:fill="FFFFFF"/>
         <w:bidi/>
-        <w:rPr>
-          <w:rFonts w:ascii="Arial" w:eastAsia="Arial" w:hAnsi="Arial" w:cs="Arial"/>
-          <w:sz w:val="24"/>
-          <w:szCs w:val="24"/>
-        </w:rPr>
-        <w:spacing w:after="60" w:line="240" w:lineRule="auto"/>
+        <w:spacing w:line="276" w:lineRule="auto"/>
+        <w:rPr>
+          <w:rFonts w:ascii="Arial" w:eastAsia="Arial" w:hAnsi="Arial" w:cs="Arial"/>
+          <w:sz w:val="24"/>
+          <w:szCs w:val="24"/>
+        </w:rPr>
       </w:pPr>
       <w:r>
         <w:rPr>
@@ -1296,12 +1305,12 @@
         <w:widowControl/>
         <w:shd w:val="clear" w:color="auto" w:fill="FFFFFF"/>
         <w:bidi/>
-        <w:rPr>
-          <w:rFonts w:ascii="Arial" w:eastAsia="Arial" w:hAnsi="Arial" w:cs="Arial"/>
-          <w:sz w:val="24"/>
-          <w:szCs w:val="24"/>
-        </w:rPr>
-        <w:spacing w:after="60" w:line="240" w:lineRule="auto"/>
+        <w:spacing w:line="276" w:lineRule="auto"/>
+        <w:rPr>
+          <w:rFonts w:ascii="Arial" w:eastAsia="Arial" w:hAnsi="Arial" w:cs="Arial"/>
+          <w:sz w:val="24"/>
+          <w:szCs w:val="24"/>
+        </w:rPr>
       </w:pPr>
       <w:bookmarkStart w:id="0" w:name="_rbchwi65eu6o" w:colFirst="0" w:colLast="0"/>
       <w:bookmarkEnd w:id="0"/>
@@ -1367,12 +1376,12 @@
         <w:widowControl/>
         <w:shd w:val="clear" w:color="auto" w:fill="FFFFFF"/>
         <w:bidi/>
-        <w:rPr>
-          <w:rFonts w:ascii="Arial" w:eastAsia="Arial" w:hAnsi="Arial" w:cs="Arial"/>
-          <w:sz w:val="24"/>
-          <w:szCs w:val="24"/>
-        </w:rPr>
-        <w:spacing w:after="60" w:line="240" w:lineRule="auto"/>
+        <w:spacing w:line="276" w:lineRule="auto"/>
+        <w:rPr>
+          <w:rFonts w:ascii="Arial" w:eastAsia="Arial" w:hAnsi="Arial" w:cs="Arial"/>
+          <w:sz w:val="24"/>
+          <w:szCs w:val="24"/>
+        </w:rPr>
       </w:pPr>
       <w:r>
         <w:rPr>
@@ -1406,7 +1415,6 @@
           <w:sz w:val="24"/>
           <w:szCs w:val="24"/>
         </w:rPr>
-        <w:spacing w:after="60" w:line="240" w:lineRule="auto"/>
       </w:pPr>
       <w:r>
         <w:rPr>
@@ -1441,7 +1449,6 @@
           <w:sz w:val="26"/>
           <w:szCs w:val="26"/>
         </w:rPr>
-        <w:spacing w:after="60" w:line="240" w:lineRule="auto"/>
       </w:pPr>
     </w:p>
     <w:p>
@@ -1457,7 +1464,6 @@
           <w:sz w:val="26"/>
           <w:szCs w:val="26"/>
         </w:rPr>
-        <w:spacing w:after="60" w:line="240" w:lineRule="auto"/>
       </w:pPr>
       <w:r>
         <w:rPr>
@@ -1545,6 +1551,7 @@
           <w:p>
             <w:pPr>
               <w:bidi/>
+              <w:spacing w:after="60" w:line="240" w:lineRule="auto"/>
               <w:jc w:val="center"/>
               <w:rPr>
                 <w:rFonts w:ascii="Arial" w:eastAsia="Arial" w:hAnsi="Arial" w:cs="Arial"/>
@@ -1552,7 +1559,6 @@
                 <w:szCs w:val="26"/>
                 <w:rtl/>
               </w:rPr>
-              <w:spacing w:after="60" w:line="240" w:lineRule="auto"/>
             </w:pPr>
             <w:r>
               <w:drawing>
@@ -1592,6 +1598,7 @@
           <w:p>
             <w:pPr>
               <w:bidi/>
+              <w:spacing w:after="60" w:line="240" w:lineRule="auto"/>
               <w:jc w:val="center"/>
               <w:rPr>
                 <w:rFonts w:ascii="Arial" w:eastAsia="Arial" w:hAnsi="Arial" w:cs="Arial"/>
@@ -1599,7 +1606,6 @@
                 <w:szCs w:val="26"/>
                 <w:rtl/>
               </w:rPr>
-              <w:spacing w:after="60" w:line="240" w:lineRule="auto"/>
             </w:pPr>
             <w:r>
               <w:rPr>
@@ -1649,6 +1655,7 @@
           <w:p>
             <w:pPr>
               <w:bidi/>
+              <w:spacing w:after="60" w:line="240" w:lineRule="auto"/>
               <w:jc w:val="center"/>
               <w:rPr>
                 <w:rFonts w:ascii="Arial" w:eastAsia="Arial" w:hAnsi="Arial" w:cs="Arial"/>
@@ -1658,7 +1665,6 @@
                 <w:b/>
                 <w:bCs/>
               </w:rPr>
-              <w:spacing w:after="60" w:line="240" w:lineRule="auto"/>
             </w:pPr>
             <w:fldSimple w:instr=" MERGEFIELD =employee_name_fr \* MERGEFORMAT ">
               <w:r>
@@ -1686,7 +1692,7 @@
 </file>
 
 <file path=word/styles.xml><?xml version="1.0" encoding="utf-8"?>
-<w:styles xmlns:mc="http://schemas.openxmlformats.org/markup-compatibility/2006" xmlns:r="http://schemas.openxmlformats.org/officeDocument/2006/relationships" xmlns:w="http://schemas.openxmlformats.org/wordprocessingml/2006/main" xmlns:w14="http://schemas.microsoft.com/office/word/2010/wordml" xmlns:w15="http://schemas.microsoft.com/office/word/2012/wordml" xmlns:w16cex="http://schemas.microsoft.com/office/word/2018/wordml/cex" xmlns:w16cid="http://schemas.microsoft.com/office/word/2016/wordml/cid" xmlns:w16="http://schemas.microsoft.com/office/word/2018/wordml" xmlns:w16du="http://schemas.microsoft.com/office/word/2023/wordml/word16du" xmlns:w16sdtdh="http://schemas.microsoft.com/office/word/2020/wordml/sdtdatahash" xmlns:w16sdtfl="http://schemas.microsoft.com/office/word/2024/wordml/sdtformatlock" xmlns:w16se="http://schemas.microsoft.com/office/word/2015/wordml/symex" mc:Ignorable="w14 w15 w16se w16cid w16 w16cex w16sdtdh w16sdtfl w16du">
+<w:styles xmlns:mc="http://schemas.openxmlformats.org/markup-compatibility/2006" xmlns:r="http://schemas.openxmlformats.org/officeDocument/2006/relationships" xmlns:w="http://schemas.openxmlformats.org/wordprocessingml/2006/main" xmlns:w14="http://schemas.microsoft.com/office/word/2010/wordml" xmlns:w15="http://schemas.microsoft.com/office/word/2012/wordml" xmlns:w16cex="http://schemas.microsoft.com/office/word/2018/wordml/cex" xmlns:w16cid="http://schemas.microsoft.com/office/word/2016/wordml/cid" xmlns:w16="http://schemas.microsoft.com/office/word/2018/wordml" xmlns:w16sdtdh="http://schemas.microsoft.com/office/word/2020/wordml/sdtdatahash" xmlns:w16sdtfl="http://schemas.microsoft.com/office/word/2024/wordml/sdtformatlock" xmlns:w16se="http://schemas.microsoft.com/office/word/2015/wordml/symex" xmlns:w16du="http://schemas.microsoft.com/office/word/2023/wordml/word16du" mc:Ignorable="w14 w15 w16se w16cid w16 w16cex w16sdtdh w16sdtfl w16du">
   <w:docDefaults>
     <w:rPrDefault>
       <w:rPr>
@@ -2085,7 +2091,7 @@
     <w:name w:val="Normal"/>
     <w:qFormat/>
   </w:style>
-  <w:style w:type="paragraph" w:styleId="Titre1">
+  <w:style w:type="paragraph" w:styleId="Heading1">
     <w:name w:val="heading 1"/>
     <w:basedOn w:val="Normal"/>
     <w:next w:val="Normal"/>
@@ -2104,7 +2110,7 @@
       <w:szCs w:val="48"/>
     </w:rPr>
   </w:style>
-  <w:style w:type="paragraph" w:styleId="Titre2">
+  <w:style w:type="paragraph" w:styleId="Heading2">
     <w:name w:val="heading 2"/>
     <w:basedOn w:val="Normal"/>
     <w:next w:val="Normal"/>
@@ -2125,7 +2131,7 @@
       <w:szCs w:val="36"/>
     </w:rPr>
   </w:style>
-  <w:style w:type="paragraph" w:styleId="Titre3">
+  <w:style w:type="paragraph" w:styleId="Heading3">
     <w:name w:val="heading 3"/>
     <w:basedOn w:val="Normal"/>
     <w:next w:val="Normal"/>
@@ -2146,7 +2152,7 @@
       <w:szCs w:val="28"/>
     </w:rPr>
   </w:style>
-  <w:style w:type="paragraph" w:styleId="Titre4">
+  <w:style w:type="paragraph" w:styleId="Heading4">
     <w:name w:val="heading 4"/>
     <w:basedOn w:val="Normal"/>
     <w:next w:val="Normal"/>
@@ -2167,7 +2173,7 @@
       <w:szCs w:val="24"/>
     </w:rPr>
   </w:style>
-  <w:style w:type="paragraph" w:styleId="Titre5">
+  <w:style w:type="paragraph" w:styleId="Heading5">
     <w:name w:val="heading 5"/>
     <w:basedOn w:val="Normal"/>
     <w:next w:val="Normal"/>
@@ -2188,7 +2194,7 @@
       <w:szCs w:val="22"/>
     </w:rPr>
   </w:style>
-  <w:style w:type="paragraph" w:styleId="Titre6">
+  <w:style w:type="paragraph" w:styleId="Heading6">
     <w:name w:val="heading 6"/>
     <w:basedOn w:val="Normal"/>
     <w:next w:val="Normal"/>
@@ -2209,13 +2215,13 @@
       <w:szCs w:val="20"/>
     </w:rPr>
   </w:style>
-  <w:style w:type="character" w:default="1" w:styleId="Policepardfaut">
+  <w:style w:type="character" w:default="1" w:styleId="DefaultParagraphFont">
     <w:name w:val="Default Paragraph Font"/>
     <w:uiPriority w:val="1"/>
     <w:semiHidden/>
     <w:unhideWhenUsed/>
   </w:style>
-  <w:style w:type="table" w:default="1" w:styleId="TableauNormal">
+  <w:style w:type="table" w:default="1" w:styleId="TableNormal">
     <w:name w:val="Normal Table"/>
     <w:uiPriority w:val="99"/>
     <w:semiHidden/>
@@ -2230,13 +2236,13 @@
       </w:tblCellMar>
     </w:tblPr>
   </w:style>
-  <w:style w:type="numbering" w:default="1" w:styleId="Aucuneliste">
+  <w:style w:type="numbering" w:default="1" w:styleId="NoList">
     <w:name w:val="No List"/>
     <w:uiPriority w:val="99"/>
     <w:semiHidden/>
     <w:unhideWhenUsed/>
   </w:style>
-  <w:style w:type="table" w:customStyle="1" w:styleId="TableNormal">
+  <w:style w:type="table" w:customStyle="1" w:styleId="TableNormal0">
     <w:name w:val="TableNormal"/>
     <w:tblPr>
       <w:tblCellMar>
@@ -2247,7 +2253,7 @@
       </w:tblCellMar>
     </w:tblPr>
   </w:style>
-  <w:style w:type="paragraph" w:styleId="Titre">
+  <w:style w:type="paragraph" w:styleId="Title">
     <w:name w:val="Title"/>
     <w:basedOn w:val="Normal"/>
     <w:next w:val="Normal"/>
@@ -2265,7 +2271,7 @@
       <w:szCs w:val="72"/>
     </w:rPr>
   </w:style>
-  <w:style w:type="paragraph" w:styleId="Sous-titre">
+  <w:style w:type="paragraph" w:styleId="Subtitle">
     <w:name w:val="Subtitle"/>
     <w:basedOn w:val="Normal"/>
     <w:next w:val="Normal"/>

</xml_diff>

<commit_message>
CDD contract: label each location level, drop amount-in-words, fix signature order
- Article 1 now labels each location piece (القرية/البلدية/المقاطعة/الولاية)
  instead of just listing bare names, so it's clear what each one refers to.
- Article 4 no longer spells out the amount in words — drops the
  "(بالحروف: ...)" parenthetical and the now-unused ArabicNumberToWords
  service.
- Signature block: the director's signature now sits below his printed
  name instead of above it.
- Trimmed header spacing slightly further to keep the (now longer)
  Article 1 line fitting on a single page.
</commit_message>
<xml_diff>
--- a/backend/lib/templates/contract_cdd.docx
+++ b/backend/lib/templates/contract_cdd.docx
@@ -39,7 +39,7 @@
         <w:widowControl/>
         <w:shd w:val="clear" w:color="auto" w:fill="FFFFFF"/>
         <w:bidi/>
-        <w:spacing w:before="60"/>
+        <w:spacing w:before="20"/>
         <w:jc w:val="left"/>
         <w:rPr>
           <w:rFonts w:ascii="Arial" w:eastAsia="Arial" w:hAnsi="Arial" w:cs="Arial"/>
@@ -66,7 +66,7 @@
         <w:widowControl/>
         <w:shd w:val="clear" w:color="auto" w:fill="FFFFFF"/>
         <w:bidi/>
-        <w:spacing w:before="60"/>
+        <w:spacing w:before="20"/>
         <w:jc w:val="left"/>
         <w:rPr>
           <w:rFonts w:ascii="Arial" w:eastAsia="Arial" w:hAnsi="Arial" w:cs="Arial"/>
@@ -89,7 +89,7 @@
         <w:widowControl/>
         <w:shd w:val="clear" w:color="auto" w:fill="FFFFFF"/>
         <w:bidi/>
-        <w:spacing w:before="60"/>
+        <w:spacing w:before="20"/>
         <w:jc w:val="left"/>
         <w:rPr>
           <w:rFonts w:ascii="Arial" w:eastAsia="Arial" w:hAnsi="Arial" w:cs="Arial"/>
@@ -103,7 +103,7 @@
         <w:widowControl/>
         <w:shd w:val="clear" w:color="auto" w:fill="FFFFFF"/>
         <w:bidi/>
-        <w:spacing w:before="60"/>
+        <w:spacing w:before="20"/>
         <w:jc w:val="center"/>
         <w:rPr>
           <w:rFonts w:ascii="Arial" w:eastAsia="Arial" w:hAnsi="Arial" w:cs="Arial"/>
@@ -205,7 +205,7 @@
         <w:widowControl/>
         <w:shd w:val="clear" w:color="auto" w:fill="FFFFFF"/>
         <w:bidi/>
-        <w:spacing w:before="60"/>
+        <w:spacing w:before="20"/>
         <w:rPr>
           <w:rFonts w:ascii="Arial" w:eastAsia="Arial" w:hAnsi="Arial" w:cs="Arial"/>
           <w:b/>
@@ -282,7 +282,7 @@
         <w:widowControl/>
         <w:shd w:val="clear" w:color="auto" w:fill="FFFFFF"/>
         <w:bidi/>
-        <w:spacing w:before="60"/>
+        <w:spacing w:before="20"/>
         <w:rPr>
           <w:rFonts w:ascii="Arial" w:eastAsia="Arial" w:hAnsi="Arial" w:cs="Arial"/>
           <w:b/>
@@ -371,7 +371,7 @@
         <w:widowControl/>
         <w:shd w:val="clear" w:color="auto" w:fill="FFFFFF"/>
         <w:bidi/>
-        <w:spacing w:before="60"/>
+        <w:spacing w:before="20"/>
         <w:rPr>
           <w:rFonts w:ascii="Arial" w:eastAsia="Arial" w:hAnsi="Arial" w:cs="Arial"/>
           <w:b/>
@@ -456,7 +456,7 @@
         <w:widowControl/>
         <w:shd w:val="clear" w:color="auto" w:fill="FFFFFF"/>
         <w:bidi/>
-        <w:spacing w:before="60"/>
+        <w:spacing w:before="20"/>
         <w:rPr>
           <w:rFonts w:ascii="Arial" w:eastAsia="Arial" w:hAnsi="Arial" w:cs="Arial"/>
           <w:b/>
@@ -495,7 +495,7 @@
         <w:widowControl/>
         <w:shd w:val="clear" w:color="auto" w:fill="FFFFFF"/>
         <w:bidi/>
-        <w:spacing w:before="60"/>
+        <w:spacing w:before="20"/>
         <w:rPr>
           <w:rFonts w:ascii="Arial" w:eastAsia="Arial" w:hAnsi="Arial" w:cs="Arial"/>
           <w:b/>
@@ -545,7 +545,7 @@
         <w:widowControl/>
         <w:shd w:val="clear" w:color="auto" w:fill="FFFFFF"/>
         <w:bidi/>
-        <w:spacing w:before="60"/>
+        <w:spacing w:before="20"/>
         <w:rPr>
           <w:rFonts w:ascii="Arial" w:eastAsia="Arial" w:hAnsi="Arial" w:cs="Arial"/>
           <w:b/>
@@ -571,7 +571,7 @@
         <w:widowControl/>
         <w:shd w:val="clear" w:color="auto" w:fill="FFFFFF"/>
         <w:bidi/>
-        <w:spacing w:before="60"/>
+        <w:spacing w:before="20"/>
         <w:rPr>
           <w:rFonts w:ascii="Arial" w:eastAsia="Arial" w:hAnsi="Arial" w:cs="Arial"/>
           <w:sz w:val="24"/>
@@ -595,7 +595,7 @@
         <w:widowControl/>
         <w:shd w:val="clear" w:color="auto" w:fill="FFFFFF"/>
         <w:bidi/>
-        <w:spacing w:before="60"/>
+        <w:spacing w:before="20"/>
         <w:rPr>
           <w:rFonts w:ascii="Arial" w:eastAsia="Arial" w:hAnsi="Arial" w:cs="Arial"/>
           <w:b/>
@@ -623,7 +623,7 @@
         <w:widowControl/>
         <w:shd w:val="clear" w:color="auto" w:fill="FFFFFF"/>
         <w:bidi/>
-        <w:spacing w:before="60" w:line="276" w:lineRule="auto"/>
+        <w:spacing w:before="20" w:line="276" w:lineRule="auto"/>
         <w:rPr>
           <w:rFonts w:ascii="Arial" w:eastAsia="Arial" w:hAnsi="Arial" w:cs="Arial"/>
           <w:sz w:val="24"/>
@@ -663,7 +663,7 @@
         <w:widowControl/>
         <w:shd w:val="clear" w:color="auto" w:fill="FFFFFF"/>
         <w:bidi/>
-        <w:spacing w:before="60" w:line="276" w:lineRule="auto"/>
+        <w:spacing w:before="20" w:line="276" w:lineRule="auto"/>
         <w:rPr>
           <w:rFonts w:ascii="Arial" w:eastAsia="Arial" w:hAnsi="Arial" w:cs="Arial"/>
           <w:sz w:val="24"/>
@@ -775,7 +775,7 @@
         <w:widowControl/>
         <w:shd w:val="clear" w:color="auto" w:fill="FFFFFF"/>
         <w:bidi/>
-        <w:spacing w:before="60" w:line="276" w:lineRule="auto"/>
+        <w:spacing w:before="20" w:line="276" w:lineRule="auto"/>
         <w:rPr>
           <w:rFonts w:ascii="Arial" w:eastAsia="Arial" w:hAnsi="Arial" w:cs="Arial"/>
           <w:sz w:val="24"/>
@@ -961,53 +961,6 @@
           <w:rtl/>
         </w:rPr>
         <w:t>أوقية</w:t>
-      </w:r>
-      <w:r>
-        <w:rPr>
-          <w:rFonts w:ascii="Arial" w:eastAsia="Arial" w:hAnsi="Arial" w:cs="Arial"/>
-          <w:sz w:val="24"/>
-          <w:szCs w:val="24"/>
-        </w:rPr>
-        <w:t xml:space="preserve"> </w:t>
-      </w:r>
-      <w:r>
-        <w:rPr>
-          <w:rFonts w:ascii="Arial" w:eastAsia="Arial" w:hAnsi="Arial" w:cs="Arial" w:hint="cs"/>
-          <w:sz w:val="24"/>
-          <w:szCs w:val="24"/>
-          <w:rtl/>
-        </w:rPr>
-        <w:t>(</w:t>
-      </w:r>
-      <w:proofErr w:type="gramEnd"/>
-      <w:r>
-        <w:rPr>
-          <w:rFonts w:ascii="Arial" w:eastAsia="Arial" w:hAnsi="Arial" w:cs="Arial"/>
-          <w:sz w:val="24"/>
-          <w:szCs w:val="24"/>
-          <w:lang w:val="fr-FR"/>
-        </w:rPr>
-        <w:t xml:space="preserve">بالحروف: </w:t>
-      </w:r>
-      <w:fldSimple w:instr=" MERGEFIELD =amount_words \* MERGEFORMAT ">
-        <w:r>
-          <w:rPr>
-            <w:rFonts w:ascii="Arial" w:eastAsia="Arial" w:hAnsi="Arial" w:cs="Arial"/>
-            <w:sz w:val="24"/>
-            <w:szCs w:val="24"/>
-            <w:lang w:val="fr-FR"/>
-          </w:rPr>
-          <w:t xml:space="preserve">«=amount_words»</w:t>
-        </w:r>
-      </w:fldSimple>
-      <w:r>
-        <w:rPr>
-          <w:rFonts w:ascii="Arial" w:eastAsia="Arial" w:hAnsi="Arial" w:cs="Arial" w:hint="cs"/>
-          <w:sz w:val="24"/>
-          <w:szCs w:val="24"/>
-          <w:rtl/>
-        </w:rPr>
-        <w:t>)</w:t>
       </w:r>
       <w:r>
         <w:rPr>
@@ -1561,6 +1514,30 @@
               </w:rPr>
             </w:pPr>
             <w:r>
+              <w:rPr>
+                <w:rFonts w:ascii="Arial" w:eastAsia="Arial" w:hAnsi="Arial" w:cs="Arial"/>
+                <w:sz w:val="26"/>
+                <w:szCs w:val="26"/>
+                <w:rtl/>
+                <w:b/>
+                <w:bCs/>
+              </w:rPr>
+              <w:t xml:space="preserve">أن أبوبكر أحمد المعلوم</w:t>
+            </w:r>
+          </w:p>
+          <w:p>
+            <w:pPr>
+              <w:bidi/>
+              <w:spacing w:after="60" w:line="240" w:lineRule="auto"/>
+              <w:jc w:val="center"/>
+              <w:rPr>
+                <w:rFonts w:ascii="Arial" w:eastAsia="Arial" w:hAnsi="Arial" w:cs="Arial"/>
+                <w:sz w:val="26"/>
+                <w:szCs w:val="26"/>
+                <w:rtl/>
+              </w:rPr>
+            </w:pPr>
+            <w:r>
               <w:drawing>
                 <wp:inline xmlns:a="http://schemas.openxmlformats.org/drawingml/2006/main" xmlns:pic="http://schemas.openxmlformats.org/drawingml/2006/picture">
                   <wp:extent cx="1007999" cy="719998"/>
@@ -1593,30 +1570,6 @@
                   </a:graphic>
                 </wp:inline>
               </w:drawing>
-            </w:r>
-          </w:p>
-          <w:p>
-            <w:pPr>
-              <w:bidi/>
-              <w:spacing w:after="60" w:line="240" w:lineRule="auto"/>
-              <w:jc w:val="center"/>
-              <w:rPr>
-                <w:rFonts w:ascii="Arial" w:eastAsia="Arial" w:hAnsi="Arial" w:cs="Arial"/>
-                <w:sz w:val="26"/>
-                <w:szCs w:val="26"/>
-                <w:rtl/>
-              </w:rPr>
-            </w:pPr>
-            <w:r>
-              <w:rPr>
-                <w:rFonts w:ascii="Arial" w:eastAsia="Arial" w:hAnsi="Arial" w:cs="Arial"/>
-                <w:sz w:val="26"/>
-                <w:szCs w:val="26"/>
-                <w:rtl/>
-                <w:b/>
-                <w:bCs/>
-              </w:rPr>
-              <w:t xml:space="preserve">أن أبوبكر أحمد المعلوم</w:t>
             </w:r>
           </w:p>
         </w:tc>

</xml_diff>

<commit_message>
Restore amount-in-words in Article 4, without the "بالحروف" label
The amount is spelled out in parentheses right after the numeric
figure, e.g. "10,000 أوقية (عشرة آلاف أوقية)." — no leading label word.
</commit_message>
<xml_diff>
--- a/backend/lib/templates/contract_cdd.docx
+++ b/backend/lib/templates/contract_cdd.docx
@@ -961,6 +961,35 @@
           <w:rtl/>
         </w:rPr>
         <w:t>أوقية</w:t>
+      </w:r>
+      <w:r>
+        <w:rPr>
+          <w:rFonts w:ascii="Arial" w:eastAsia="Arial" w:hAnsi="Arial" w:cs="Arial"/>
+          <w:sz w:val="24"/>
+          <w:szCs w:val="24"/>
+          <w:rtl/>
+        </w:rPr>
+        <w:t xml:space="preserve"> (</w:t>
+      </w:r>
+      <w:fldSimple w:instr=" MERGEFIELD =amount_words \* MERGEFORMAT ">
+        <w:r>
+          <w:rPr>
+            <w:rFonts w:ascii="Arial" w:eastAsia="Arial" w:hAnsi="Arial" w:cs="Arial"/>
+            <w:sz w:val="24"/>
+            <w:szCs w:val="24"/>
+            <w:rtl/>
+          </w:rPr>
+          <w:t xml:space="preserve">«=amount_words»</w:t>
+        </w:r>
+      </w:fldSimple>
+      <w:r>
+        <w:rPr>
+          <w:rFonts w:ascii="Arial" w:eastAsia="Arial" w:hAnsi="Arial" w:cs="Arial"/>
+          <w:sz w:val="24"/>
+          <w:szCs w:val="24"/>
+          <w:rtl/>
+        </w:rPr>
+        <w:t xml:space="preserve">)</w:t>
       </w:r>
       <w:r>
         <w:rPr>

</xml_diff>